<commit_message>
feat: informe sistema gestión actualizado
</commit_message>
<xml_diff>
--- a/Documentacion/Informe/Sistema gestión Inventario Input Medical.docx
+++ b/Documentacion/Informe/Sistema gestión Inventario Input Medical.docx
@@ -17,7 +17,7 @@
           <wp:inline distB="0" distT="0" distL="0" distR="0">
             <wp:extent cx="5400040" cy="1350010"/>
             <wp:effectExtent b="0" l="0" r="0" t="0"/>
-            <wp:docPr descr="EscuelaIT Duoc UC - Escuela de Informática y Telecomunicaciones Duoc UC -  Duoc UC | LinkedIn" id="8" name="image4.jpg"/>
+            <wp:docPr descr="EscuelaIT Duoc UC - Escuela de Informática y Telecomunicaciones Duoc UC -  Duoc UC | LinkedIn" id="9" name="image4.jpg"/>
             <a:graphic>
               <a:graphicData uri="http://schemas.openxmlformats.org/drawingml/2006/picture">
                 <pic:pic>
@@ -471,7 +471,7 @@
     </w:p>
     <w:sdt>
       <w:sdtPr>
-        <w:id w:val="-1361636479"/>
+        <w:id w:val="-259381192"/>
         <w:docPartObj>
           <w:docPartGallery w:val="Table of Contents"/>
           <w:docPartUnique w:val="1"/>
@@ -2032,7 +2032,7 @@
       <w:pPr>
         <w:numPr>
           <w:ilvl w:val="0"/>
-          <w:numId w:val="15"/>
+          <w:numId w:val="16"/>
         </w:numPr>
         <w:spacing w:after="0" w:afterAutospacing="0" w:before="240" w:lineRule="auto"/>
         <w:ind w:left="720" w:hanging="360"/>
@@ -2049,7 +2049,7 @@
       <w:pPr>
         <w:numPr>
           <w:ilvl w:val="0"/>
-          <w:numId w:val="15"/>
+          <w:numId w:val="16"/>
         </w:numPr>
         <w:spacing w:after="0" w:afterAutospacing="0" w:before="0" w:beforeAutospacing="0" w:lineRule="auto"/>
         <w:ind w:left="720" w:hanging="360"/>
@@ -2066,7 +2066,7 @@
       <w:pPr>
         <w:numPr>
           <w:ilvl w:val="0"/>
-          <w:numId w:val="15"/>
+          <w:numId w:val="16"/>
         </w:numPr>
         <w:spacing w:after="0" w:afterAutospacing="0" w:before="0" w:beforeAutospacing="0" w:lineRule="auto"/>
         <w:ind w:left="720" w:hanging="360"/>
@@ -2083,7 +2083,7 @@
       <w:pPr>
         <w:numPr>
           <w:ilvl w:val="0"/>
-          <w:numId w:val="15"/>
+          <w:numId w:val="16"/>
         </w:numPr>
         <w:spacing w:after="0" w:afterAutospacing="0" w:before="0" w:beforeAutospacing="0" w:lineRule="auto"/>
         <w:ind w:left="720" w:hanging="360"/>
@@ -2100,7 +2100,7 @@
       <w:pPr>
         <w:numPr>
           <w:ilvl w:val="0"/>
-          <w:numId w:val="15"/>
+          <w:numId w:val="16"/>
         </w:numPr>
         <w:spacing w:after="240" w:before="0" w:beforeAutospacing="0" w:lineRule="auto"/>
         <w:ind w:left="720" w:hanging="360"/>
@@ -2953,7 +2953,7 @@
       <w:pPr>
         <w:numPr>
           <w:ilvl w:val="0"/>
-          <w:numId w:val="14"/>
+          <w:numId w:val="15"/>
         </w:numPr>
         <w:ind w:left="720" w:hanging="360"/>
         <w:rPr/>
@@ -2969,7 +2969,7 @@
       <w:pPr>
         <w:numPr>
           <w:ilvl w:val="0"/>
-          <w:numId w:val="14"/>
+          <w:numId w:val="15"/>
         </w:numPr>
         <w:ind w:left="720" w:hanging="360"/>
         <w:rPr/>
@@ -2985,7 +2985,7 @@
       <w:pPr>
         <w:numPr>
           <w:ilvl w:val="0"/>
-          <w:numId w:val="14"/>
+          <w:numId w:val="15"/>
         </w:numPr>
         <w:ind w:left="720" w:hanging="360"/>
         <w:rPr/>
@@ -3001,7 +3001,7 @@
       <w:pPr>
         <w:numPr>
           <w:ilvl w:val="0"/>
-          <w:numId w:val="14"/>
+          <w:numId w:val="15"/>
         </w:numPr>
         <w:ind w:left="720" w:hanging="360"/>
         <w:rPr/>
@@ -3235,12 +3235,12 @@
           <wp:inline distB="114300" distT="114300" distL="114300" distR="114300">
             <wp:extent cx="5731200" cy="1384300"/>
             <wp:effectExtent b="0" l="0" r="0" t="0"/>
-            <wp:docPr id="4" name="image7.png"/>
+            <wp:docPr id="4" name="image5.png"/>
             <a:graphic>
               <a:graphicData uri="http://schemas.openxmlformats.org/drawingml/2006/picture">
                 <pic:pic>
                   <pic:nvPicPr>
-                    <pic:cNvPr id="0" name="image7.png"/>
+                    <pic:cNvPr id="0" name="image5.png"/>
                     <pic:cNvPicPr preferRelativeResize="0"/>
                   </pic:nvPicPr>
                   <pic:blipFill>
@@ -3353,12 +3353,12 @@
           <wp:inline distB="114300" distT="114300" distL="114300" distR="114300">
             <wp:extent cx="5731200" cy="1409700"/>
             <wp:effectExtent b="0" l="0" r="0" t="0"/>
-            <wp:docPr id="3" name="image2.png"/>
+            <wp:docPr id="3" name="image1.png"/>
             <a:graphic>
               <a:graphicData uri="http://schemas.openxmlformats.org/drawingml/2006/picture">
                 <pic:pic>
                   <pic:nvPicPr>
-                    <pic:cNvPr id="0" name="image2.png"/>
+                    <pic:cNvPr id="0" name="image1.png"/>
                     <pic:cNvPicPr preferRelativeResize="0"/>
                   </pic:nvPicPr>
                   <pic:blipFill>
@@ -3400,12 +3400,12 @@
           <wp:inline distB="114300" distT="114300" distL="114300" distR="114300">
             <wp:extent cx="4752975" cy="1114425"/>
             <wp:effectExtent b="0" l="0" r="0" t="0"/>
-            <wp:docPr id="6" name="image1.png"/>
+            <wp:docPr id="6" name="image6.png"/>
             <a:graphic>
               <a:graphicData uri="http://schemas.openxmlformats.org/drawingml/2006/picture">
                 <pic:pic>
                   <pic:nvPicPr>
-                    <pic:cNvPr id="0" name="image1.png"/>
+                    <pic:cNvPr id="0" name="image6.png"/>
                     <pic:cNvPicPr preferRelativeResize="0"/>
                   </pic:nvPicPr>
                   <pic:blipFill>
@@ -4018,6 +4018,136 @@
       <w:pPr>
         <w:numPr>
           <w:ilvl w:val="0"/>
+          <w:numId w:val="14"/>
+        </w:numPr>
+        <w:spacing w:after="0" w:afterAutospacing="0" w:before="240" w:lineRule="auto"/>
+        <w:ind w:left="720" w:hanging="360"/>
+        <w:rPr/>
+      </w:pPr>
+      <w:r>
+        <w:rPr>
+          <w:rtl w:val="0"/>
+        </w:rPr>
+        <w:t xml:space="preserve">Base de datos relacional PostgreSQL </w:t>
+      </w:r>
+    </w:p>
+    <w:p>
+      <w:pPr>
+        <w:numPr>
+          <w:ilvl w:val="0"/>
+          <w:numId w:val="14"/>
+        </w:numPr>
+        <w:spacing w:after="0" w:afterAutospacing="0" w:before="0" w:beforeAutospacing="0" w:lineRule="auto"/>
+        <w:ind w:left="720" w:hanging="360"/>
+        <w:rPr/>
+      </w:pPr>
+      <w:r>
+        <w:rPr>
+          <w:rtl w:val="0"/>
+        </w:rPr>
+        <w:t xml:space="preserve">Generación automática de APIs REST</w:t>
+      </w:r>
+    </w:p>
+    <w:p>
+      <w:pPr>
+        <w:numPr>
+          <w:ilvl w:val="0"/>
+          <w:numId w:val="14"/>
+        </w:numPr>
+        <w:spacing w:after="0" w:afterAutospacing="0" w:before="0" w:beforeAutospacing="0" w:lineRule="auto"/>
+        <w:ind w:left="720" w:hanging="360"/>
+        <w:rPr/>
+      </w:pPr>
+      <w:r>
+        <w:rPr>
+          <w:rtl w:val="0"/>
+        </w:rPr>
+        <w:t xml:space="preserve">Servicios de autenticación de usuarios</w:t>
+      </w:r>
+    </w:p>
+    <w:p>
+      <w:pPr>
+        <w:numPr>
+          <w:ilvl w:val="0"/>
+          <w:numId w:val="14"/>
+        </w:numPr>
+        <w:spacing w:after="240" w:before="0" w:beforeAutospacing="0" w:lineRule="auto"/>
+        <w:ind w:left="720" w:hanging="360"/>
+        <w:rPr/>
+      </w:pPr>
+      <w:r>
+        <w:rPr>
+          <w:rtl w:val="0"/>
+        </w:rPr>
+        <w:t xml:space="preserve">Gestión de almacenamiento y seguridad</w:t>
+      </w:r>
+    </w:p>
+    <w:p>
+      <w:pPr>
+        <w:spacing w:after="240" w:before="240" w:lineRule="auto"/>
+        <w:rPr/>
+      </w:pPr>
+      <w:r>
+        <w:rPr>
+          <w:rtl w:val="0"/>
+        </w:rPr>
+        <w:t xml:space="preserve">El uso de PaaS permite abstraer la gestión de servidores, facilitando el desarrollo y reduciendo la complejidad de implementación.</w:t>
+      </w:r>
+    </w:p>
+    <w:p>
+      <w:pPr>
+        <w:pStyle w:val="Heading2"/>
+        <w:keepNext w:val="0"/>
+        <w:keepLines w:val="0"/>
+        <w:spacing w:before="280" w:lineRule="auto"/>
+        <w:rPr>
+          <w:b w:val="1"/>
+          <w:bCs w:val="1"/>
+          <w:sz w:val="22"/>
+          <w:szCs w:val="22"/>
+        </w:rPr>
+      </w:pPr>
+      <w:bookmarkStart w:colFirst="0" w:colLast="0" w:name="_trnr21vr5t6i" w:id="17"/>
+      <w:bookmarkEnd w:id="17"/>
+      <w:r>
+        <w:rPr>
+          <w:b w:val="1"/>
+          <w:bCs w:val="1"/>
+          <w:sz w:val="22"/>
+          <w:szCs w:val="22"/>
+          <w:rtl w:val="0"/>
+        </w:rPr>
+        <w:t xml:space="preserve">SaaS (Software as a Service)</w:t>
+      </w:r>
+    </w:p>
+    <w:p>
+      <w:pPr>
+        <w:spacing w:after="240" w:before="240" w:lineRule="auto"/>
+        <w:rPr/>
+      </w:pPr>
+      <w:r>
+        <w:rPr>
+          <w:rtl w:val="0"/>
+        </w:rPr>
+        <w:t xml:space="preserve">La solución final se entregará como una aplicación web accesible a través de navegador, lo que corresponde a un modelo SaaS.</w:t>
+      </w:r>
+    </w:p>
+    <w:p>
+      <w:pPr>
+        <w:spacing w:after="240" w:before="240" w:lineRule="auto"/>
+        <w:rPr/>
+      </w:pPr>
+      <w:r>
+        <w:rPr>
+          <w:rtl w:val="0"/>
+        </w:rPr>
+        <w:t xml:space="preserve">Esto implica que:</w:t>
+      </w:r>
+    </w:p>
+    <w:p>
+      <w:pPr>
+        <w:numPr>
+          <w:ilvl w:val="0"/>
           <w:numId w:val="13"/>
         </w:numPr>
         <w:spacing w:after="0" w:afterAutospacing="0" w:before="240" w:lineRule="auto"/>
@@ -4028,7 +4158,7 @@
         <w:rPr>
           <w:rtl w:val="0"/>
         </w:rPr>
-        <w:t xml:space="preserve">Base de datos relacional PostgreSQL </w:t>
+        <w:t xml:space="preserve">El usuario accede al sistema sin necesidad de instalar software</w:t>
       </w:r>
     </w:p>
     <w:p>
@@ -4045,24 +4175,7 @@
         <w:rPr>
           <w:rtl w:val="0"/>
         </w:rPr>
-        <w:t xml:space="preserve">Generación automática de APIs REST</w:t>
-      </w:r>
-    </w:p>
-    <w:p>
-      <w:pPr>
-        <w:numPr>
-          <w:ilvl w:val="0"/>
-          <w:numId w:val="13"/>
-        </w:numPr>
-        <w:spacing w:after="0" w:afterAutospacing="0" w:before="0" w:beforeAutospacing="0" w:lineRule="auto"/>
-        <w:ind w:left="720" w:hanging="360"/>
-        <w:rPr/>
-      </w:pPr>
-      <w:r>
-        <w:rPr>
-          <w:rtl w:val="0"/>
-        </w:rPr>
-        <w:t xml:space="preserve">Servicios de autenticación de usuarios</w:t>
+        <w:t xml:space="preserve">La información se encuentra disponible en línea</w:t>
       </w:r>
     </w:p>
     <w:p>
@@ -4079,7 +4192,7 @@
         <w:rPr>
           <w:rtl w:val="0"/>
         </w:rPr>
-        <w:t xml:space="preserve">Gestión de almacenamiento y seguridad</w:t>
+        <w:t xml:space="preserve">El sistema puede ser utilizado desde cualquier ubicación con acceso a internet</w:t>
       </w:r>
     </w:p>
     <w:p>
@@ -4091,7 +4204,7 @@
         <w:rPr>
           <w:rtl w:val="0"/>
         </w:rPr>
-        <w:t xml:space="preserve">El uso de PaaS permite abstraer la gestión de servidores, facilitando el desarrollo y reduciendo la complejidad de implementación.</w:t>
+        <w:t xml:space="preserve">Este modelo es adecuado para el cliente, ya que simplifica el uso del sistema y reduce la necesidad de conocimientos técnicos.</w:t>
       </w:r>
     </w:p>
     <w:p>
@@ -4107,8 +4220,8 @@
           <w:szCs w:val="22"/>
         </w:rPr>
       </w:pPr>
-      <w:bookmarkStart w:colFirst="0" w:colLast="0" w:name="_trnr21vr5t6i" w:id="17"/>
-      <w:bookmarkEnd w:id="17"/>
+      <w:bookmarkStart w:colFirst="0" w:colLast="0" w:name="_j34yvyncpm68" w:id="18"/>
+      <w:bookmarkEnd w:id="18"/>
       <w:r>
         <w:rPr>
           <w:b w:val="1"/>
@@ -4117,7 +4230,7 @@
           <w:szCs w:val="22"/>
           <w:rtl w:val="0"/>
         </w:rPr>
-        <w:t xml:space="preserve">SaaS (Software as a Service)</w:t>
+        <w:t xml:space="preserve">IaaS (Infrastructure as a Service)</w:t>
       </w:r>
     </w:p>
     <w:p>
@@ -4129,7 +4242,33 @@
         <w:rPr>
           <w:rtl w:val="0"/>
         </w:rPr>
-        <w:t xml:space="preserve">La solución final se entregará como una aplicación web accesible a través de navegador, lo que corresponde a un modelo SaaS.</w:t>
+        <w:t xml:space="preserve">No se contempla el uso directo de servicios IaaS en el proyecto, ya que la infraestructura es gestionada de forma transparente por la plataforma utilizada (Supabase).</w:t>
+      </w:r>
+    </w:p>
+    <w:p>
+      <w:pPr>
+        <w:pStyle w:val="Heading2"/>
+        <w:keepNext w:val="0"/>
+        <w:keepLines w:val="0"/>
+        <w:spacing w:after="80" w:lineRule="auto"/>
+        <w:rPr>
+          <w:b w:val="1"/>
+          <w:bCs w:val="1"/>
+          <w:sz w:val="22"/>
+          <w:szCs w:val="22"/>
+        </w:rPr>
+      </w:pPr>
+      <w:bookmarkStart w:colFirst="0" w:colLast="0" w:name="_a0gkkbaebyfw" w:id="19"/>
+      <w:bookmarkEnd w:id="19"/>
+      <w:r>
+        <w:rPr>
+          <w:b w:val="1"/>
+          <w:bCs w:val="1"/>
+          <w:sz w:val="22"/>
+          <w:szCs w:val="22"/>
+          <w:rtl w:val="0"/>
+        </w:rPr>
+        <w:t xml:space="preserve">Justificación:</w:t>
       </w:r>
     </w:p>
     <w:p>
@@ -4141,7 +4280,7 @@
         <w:rPr>
           <w:rtl w:val="0"/>
         </w:rPr>
-        <w:t xml:space="preserve">Esto implica que:</w:t>
+        <w:t xml:space="preserve">El uso de servicios cloud permite:</w:t>
       </w:r>
     </w:p>
     <w:p>
@@ -4158,7 +4297,7 @@
         <w:rPr>
           <w:rtl w:val="0"/>
         </w:rPr>
-        <w:t xml:space="preserve">El usuario accede al sistema sin necesidad de instalar software</w:t>
+        <w:t xml:space="preserve">Disponibilidad del sistema en tiempo real</w:t>
       </w:r>
     </w:p>
     <w:p>
@@ -4175,7 +4314,24 @@
         <w:rPr>
           <w:rtl w:val="0"/>
         </w:rPr>
-        <w:t xml:space="preserve">La información se encuentra disponible en línea</w:t>
+        <w:t xml:space="preserve">Reducción de costos en infraestructura</w:t>
+      </w:r>
+    </w:p>
+    <w:p>
+      <w:pPr>
+        <w:numPr>
+          <w:ilvl w:val="0"/>
+          <w:numId w:val="12"/>
+        </w:numPr>
+        <w:spacing w:after="0" w:afterAutospacing="0" w:before="0" w:beforeAutospacing="0" w:lineRule="auto"/>
+        <w:ind w:left="720" w:hanging="360"/>
+        <w:rPr/>
+      </w:pPr>
+      <w:r>
+        <w:rPr>
+          <w:rtl w:val="0"/>
+        </w:rPr>
+        <w:t xml:space="preserve">Escalabilidad según el crecimiento del negocio</w:t>
       </w:r>
     </w:p>
     <w:p>
@@ -4192,27 +4348,12 @@
         <w:rPr>
           <w:rtl w:val="0"/>
         </w:rPr>
-        <w:t xml:space="preserve">El sistema puede ser utilizado desde cualquier ubicación con acceso a internet</w:t>
+        <w:t xml:space="preserve">Mayor seguridad en el almacenamiento de datos</w:t>
       </w:r>
     </w:p>
     <w:p>
       <w:pPr>
         <w:spacing w:after="240" w:before="240" w:lineRule="auto"/>
-        <w:rPr/>
-      </w:pPr>
-      <w:r>
-        <w:rPr>
-          <w:rtl w:val="0"/>
-        </w:rPr>
-        <w:t xml:space="preserve">Este modelo es adecuado para el cliente, ya que simplifica el uso del sistema y reduce la necesidad de conocimientos técnicos.</w:t>
-      </w:r>
-    </w:p>
-    <w:p>
-      <w:pPr>
-        <w:pStyle w:val="Heading2"/>
-        <w:keepNext w:val="0"/>
-        <w:keepLines w:val="0"/>
-        <w:spacing w:before="280" w:lineRule="auto"/>
         <w:rPr>
           <w:b w:val="1"/>
           <w:bCs w:val="1"/>
@@ -4220,17 +4361,67 @@
           <w:szCs w:val="22"/>
         </w:rPr>
       </w:pPr>
-      <w:bookmarkStart w:colFirst="0" w:colLast="0" w:name="_j34yvyncpm68" w:id="18"/>
-      <w:bookmarkEnd w:id="18"/>
-      <w:r>
+      <w:r>
+        <w:rPr>
+          <w:rtl w:val="0"/>
+        </w:rPr>
+        <w:t xml:space="preserve">En conjunto, la adopción de estos modelos permite implementar una solución moderna, eficiente y alineada con las prácticas actuales de desarrollo de software en la nube.</w:t>
+      </w:r>
+      <w:r>
+        <w:rPr>
+          <w:rtl w:val="0"/>
+        </w:rPr>
+      </w:r>
+    </w:p>
+    <w:p>
+      <w:pPr>
+        <w:pStyle w:val="Heading1"/>
         <w:rPr>
           <w:b w:val="1"/>
           <w:bCs w:val="1"/>
           <w:sz w:val="22"/>
           <w:szCs w:val="22"/>
-          <w:rtl w:val="0"/>
-        </w:rPr>
-        <w:t xml:space="preserve">IaaS (Infrastructure as a Service)</w:t>
+        </w:rPr>
+      </w:pPr>
+      <w:bookmarkStart w:colFirst="0" w:colLast="0" w:name="_xbevc14wn4is" w:id="20"/>
+      <w:bookmarkEnd w:id="20"/>
+      <w:r>
+        <w:rPr>
+          <w:rtl w:val="0"/>
+        </w:rPr>
+      </w:r>
+    </w:p>
+    <w:p>
+      <w:pPr>
+        <w:pStyle w:val="Heading1"/>
+        <w:rPr>
+          <w:b w:val="1"/>
+          <w:bCs w:val="1"/>
+          <w:sz w:val="28"/>
+          <w:szCs w:val="28"/>
+        </w:rPr>
+      </w:pPr>
+      <w:bookmarkStart w:colFirst="0" w:colLast="0" w:name="_fy0rcpeymfkg" w:id="21"/>
+      <w:bookmarkEnd w:id="21"/>
+      <w:r>
+        <w:rPr>
+          <w:b w:val="1"/>
+          <w:bCs w:val="1"/>
+          <w:sz w:val="28"/>
+          <w:szCs w:val="28"/>
+          <w:rtl w:val="0"/>
+        </w:rPr>
+        <w:t xml:space="preserve">8. Conceptualización</w:t>
+      </w:r>
+    </w:p>
+    <w:p>
+      <w:pPr>
+        <w:rPr/>
+      </w:pPr>
+      <w:r>
+        <w:rPr>
+          <w:rtl w:val="0"/>
+        </w:rPr>
       </w:r>
     </w:p>
     <w:p>
@@ -4242,33 +4433,1082 @@
         <w:rPr>
           <w:rtl w:val="0"/>
         </w:rPr>
-        <w:t xml:space="preserve">No se contempla el uso directo de servicios IaaS en el proyecto, ya que la infraestructura es gestionada de forma transparente por la plataforma utilizada (Supabase).</w:t>
-      </w:r>
-    </w:p>
-    <w:p>
-      <w:pPr>
-        <w:pStyle w:val="Heading2"/>
+        <w:t xml:space="preserve">Para garantizar que la solución sea viable y profesional, se han definido los siguientes atributos de calidad basados en el estándar </w:t>
+      </w:r>
+      <w:r>
+        <w:rPr>
+          <w:b w:val="1"/>
+          <w:bCs w:val="1"/>
+          <w:rtl w:val="0"/>
+        </w:rPr>
+        <w:t xml:space="preserve">ISO/IEC 25010</w:t>
+      </w:r>
+      <w:r>
+        <w:rPr>
+          <w:rtl w:val="0"/>
+        </w:rPr>
+        <w:t xml:space="preserve">:</w:t>
+      </w:r>
+    </w:p>
+    <w:p>
+      <w:pPr>
+        <w:numPr>
+          <w:ilvl w:val="0"/>
+          <w:numId w:val="1"/>
+        </w:numPr>
+        <w:spacing w:after="0" w:afterAutospacing="0" w:before="240" w:lineRule="auto"/>
+        <w:ind w:left="720" w:hanging="360"/>
+        <w:rPr/>
+      </w:pPr>
+      <w:r>
+        <w:rPr>
+          <w:b w:val="1"/>
+          <w:bCs w:val="1"/>
+          <w:rtl w:val="0"/>
+        </w:rPr>
+        <w:t xml:space="preserve">Integridad:</w:t>
+      </w:r>
+      <w:r>
+        <w:rPr>
+          <w:rtl w:val="0"/>
+        </w:rPr>
+        <w:t xml:space="preserve"> Se asegura mediante el uso de </w:t>
+      </w:r>
+      <w:r>
+        <w:rPr>
+          <w:b w:val="1"/>
+          <w:bCs w:val="1"/>
+          <w:rtl w:val="0"/>
+        </w:rPr>
+        <w:t xml:space="preserve">restricciones (constraints)</w:t>
+      </w:r>
+      <w:r>
+        <w:rPr>
+          <w:rtl w:val="0"/>
+        </w:rPr>
+        <w:t xml:space="preserve"> en la base de datos PostgreSQL y el uso de </w:t>
+      </w:r>
+      <w:r>
+        <w:rPr>
+          <w:b w:val="1"/>
+          <w:bCs w:val="1"/>
+          <w:rtl w:val="0"/>
+        </w:rPr>
+        <w:t xml:space="preserve">transacciones</w:t>
+      </w:r>
+      <w:r>
+        <w:rPr>
+          <w:rtl w:val="0"/>
+        </w:rPr>
+        <w:t xml:space="preserve">. Esto garantiza que si una entrada de inventario falla a mitad de camino, los datos no queden corruptos ni parciales.</w:t>
+      </w:r>
+    </w:p>
+    <w:p>
+      <w:pPr>
+        <w:numPr>
+          <w:ilvl w:val="0"/>
+          <w:numId w:val="1"/>
+        </w:numPr>
+        <w:spacing w:after="0" w:afterAutospacing="0" w:before="0" w:beforeAutospacing="0" w:lineRule="auto"/>
+        <w:ind w:left="720" w:hanging="360"/>
+        <w:rPr/>
+      </w:pPr>
+      <w:r>
+        <w:rPr>
+          <w:b w:val="1"/>
+          <w:bCs w:val="1"/>
+          <w:rtl w:val="0"/>
+        </w:rPr>
+        <w:t xml:space="preserve">Confiabilidad:</w:t>
+      </w:r>
+      <w:r>
+        <w:rPr>
+          <w:rtl w:val="0"/>
+        </w:rPr>
+        <w:t xml:space="preserve"> Al utilizar una infraestructura </w:t>
+      </w:r>
+      <w:r>
+        <w:rPr>
+          <w:b w:val="1"/>
+          <w:bCs w:val="1"/>
+          <w:rtl w:val="0"/>
+        </w:rPr>
+        <w:t xml:space="preserve">PaaS (Supabase)</w:t>
+      </w:r>
+      <w:r>
+        <w:rPr>
+          <w:rtl w:val="0"/>
+        </w:rPr>
+        <w:t xml:space="preserve">, el sistema hereda una disponibilidad del 99.9%. La lógica FIFO está programada a nivel de base de datos para asegurar que el cálculo de vencimientos sea siempre consistente.</w:t>
+      </w:r>
+    </w:p>
+    <w:p>
+      <w:pPr>
+        <w:numPr>
+          <w:ilvl w:val="0"/>
+          <w:numId w:val="1"/>
+        </w:numPr>
+        <w:spacing w:after="0" w:afterAutospacing="0" w:before="0" w:beforeAutospacing="0" w:lineRule="auto"/>
+        <w:ind w:left="720" w:hanging="360"/>
+        <w:rPr/>
+      </w:pPr>
+      <w:r>
+        <w:rPr>
+          <w:b w:val="1"/>
+          <w:bCs w:val="1"/>
+          <w:rtl w:val="0"/>
+        </w:rPr>
+        <w:t xml:space="preserve">Precisión (Nivel de detalle):</w:t>
+      </w:r>
+      <w:r>
+        <w:rPr>
+          <w:rtl w:val="0"/>
+        </w:rPr>
+        <w:t xml:space="preserve"> La información entregada responde exactamente a los requerimientos del cliente mediante un modelo de datos que registra: SKU, lote, fecha de vencimiento exacta, usuario que realizó el movimiento y marca de tiempo (timestamp). Esto elimina la ambigüedad de las planillas Excel.</w:t>
+      </w:r>
+    </w:p>
+    <w:p>
+      <w:pPr>
+        <w:numPr>
+          <w:ilvl w:val="0"/>
+          <w:numId w:val="1"/>
+        </w:numPr>
+        <w:spacing w:after="0" w:afterAutospacing="0" w:before="0" w:beforeAutospacing="0" w:lineRule="auto"/>
+        <w:ind w:left="720" w:hanging="360"/>
+        <w:rPr/>
+      </w:pPr>
+      <w:r>
+        <w:rPr>
+          <w:b w:val="1"/>
+          <w:bCs w:val="1"/>
+          <w:rtl w:val="0"/>
+        </w:rPr>
+        <w:t xml:space="preserve">Oportunidad:</w:t>
+      </w:r>
+      <w:r>
+        <w:rPr>
+          <w:rtl w:val="0"/>
+        </w:rPr>
+        <w:t xml:space="preserve"> El sistema garantiza que la información sea </w:t>
+      </w:r>
+      <w:r>
+        <w:rPr>
+          <w:b w:val="1"/>
+          <w:bCs w:val="1"/>
+          <w:rtl w:val="0"/>
+        </w:rPr>
+        <w:t xml:space="preserve">síncrona</w:t>
+      </w:r>
+      <w:r>
+        <w:rPr>
+          <w:rtl w:val="0"/>
+        </w:rPr>
+        <w:t xml:space="preserve">. Gracias a las suscripciones de Supabase (Realtime), cualquier egreso de producto se refleja en el panel de control de forma inmediata, permitiendo una toma de decisiones basada en el stock real del momento.</w:t>
+      </w:r>
+    </w:p>
+    <w:p>
+      <w:pPr>
+        <w:numPr>
+          <w:ilvl w:val="0"/>
+          <w:numId w:val="1"/>
+        </w:numPr>
+        <w:spacing w:after="0" w:afterAutospacing="0" w:before="0" w:beforeAutospacing="0" w:lineRule="auto"/>
+        <w:ind w:left="720" w:hanging="360"/>
+        <w:rPr/>
+      </w:pPr>
+      <w:r>
+        <w:rPr>
+          <w:b w:val="1"/>
+          <w:bCs w:val="1"/>
+          <w:rtl w:val="0"/>
+        </w:rPr>
+        <w:t xml:space="preserve">Seguridad:</w:t>
+      </w:r>
+      <w:r>
+        <w:rPr>
+          <w:rtl w:val="0"/>
+        </w:rPr>
+        <w:t xml:space="preserve"> Se implementa un modelo de seguridad robusto basado en:</w:t>
+      </w:r>
+    </w:p>
+    <w:p>
+      <w:pPr>
+        <w:numPr>
+          <w:ilvl w:val="1"/>
+          <w:numId w:val="1"/>
+        </w:numPr>
+        <w:spacing w:after="0" w:afterAutospacing="0" w:before="0" w:beforeAutospacing="0" w:lineRule="auto"/>
+        <w:ind w:left="1440" w:hanging="360"/>
+        <w:rPr/>
+      </w:pPr>
+      <w:r>
+        <w:rPr>
+          <w:b w:val="1"/>
+          <w:bCs w:val="1"/>
+          <w:rtl w:val="0"/>
+        </w:rPr>
+        <w:t xml:space="preserve">Autenticación:</w:t>
+      </w:r>
+      <w:r>
+        <w:rPr>
+          <w:rtl w:val="0"/>
+        </w:rPr>
+        <w:t xml:space="preserve"> Gestión de usuarios mediante JWT (JSON Web Tokens).</w:t>
+      </w:r>
+    </w:p>
+    <w:p>
+      <w:pPr>
+        <w:numPr>
+          <w:ilvl w:val="1"/>
+          <w:numId w:val="1"/>
+        </w:numPr>
+        <w:spacing w:after="240" w:before="0" w:beforeAutospacing="0" w:lineRule="auto"/>
+        <w:ind w:left="1440" w:hanging="360"/>
+        <w:rPr/>
+      </w:pPr>
+      <w:r>
+        <w:rPr>
+          <w:b w:val="1"/>
+          <w:bCs w:val="1"/>
+          <w:rtl w:val="0"/>
+        </w:rPr>
+        <w:t xml:space="preserve">Autorización (RLS):</w:t>
+      </w:r>
+      <w:r>
+        <w:rPr>
+          <w:rtl w:val="0"/>
+        </w:rPr>
+        <w:t xml:space="preserve"> Uso de </w:t>
+      </w:r>
+      <w:r>
+        <w:rPr>
+          <w:i w:val="1"/>
+          <w:iCs w:val="1"/>
+          <w:rtl w:val="0"/>
+        </w:rPr>
+        <w:t xml:space="preserve">Row Level Security</w:t>
+      </w:r>
+      <w:r>
+        <w:rPr>
+          <w:rtl w:val="0"/>
+        </w:rPr>
+        <w:t xml:space="preserve"> en la base de datos para asegurar que solo usuarios autorizados puedan modificar registros críticos.</w:t>
+      </w:r>
+    </w:p>
+    <w:p>
+      <w:pPr>
+        <w:pStyle w:val="Heading1"/>
+        <w:spacing w:after="240" w:before="240" w:lineRule="auto"/>
+        <w:rPr>
+          <w:b w:val="1"/>
+          <w:bCs w:val="1"/>
+        </w:rPr>
+      </w:pPr>
+      <w:bookmarkStart w:colFirst="0" w:colLast="0" w:name="_52xz5ict7y33" w:id="22"/>
+      <w:bookmarkEnd w:id="22"/>
+      <w:r>
+        <w:rPr>
+          <w:rtl w:val="0"/>
+        </w:rPr>
+        <w:t xml:space="preserve">9</w:t>
+      </w:r>
+      <w:r>
+        <w:rPr>
+          <w:rtl w:val="0"/>
+        </w:rPr>
+        <w:t xml:space="preserve">. </w:t>
+      </w:r>
+      <w:r>
+        <w:rPr>
+          <w:b w:val="1"/>
+          <w:bCs w:val="1"/>
+          <w:rtl w:val="0"/>
+        </w:rPr>
+        <w:t xml:space="preserve">Metodología</w:t>
+      </w:r>
+    </w:p>
+    <w:p>
+      <w:pPr>
+        <w:rPr/>
+      </w:pPr>
+      <w:r>
+        <w:rPr>
+          <w:rtl w:val="0"/>
+        </w:rPr>
+        <w:tab/>
+        <w:t xml:space="preserve">El proyecto se desarrolló bajo la </w:t>
+      </w:r>
+      <w:r>
+        <w:rPr>
+          <w:b w:val="1"/>
+          <w:bCs w:val="1"/>
+          <w:rtl w:val="0"/>
+        </w:rPr>
+        <w:t xml:space="preserve">metodología en cascada</w:t>
+      </w:r>
+      <w:r>
+        <w:rPr>
+          <w:rtl w:val="0"/>
+        </w:rPr>
+        <w:t xml:space="preserve">, caracterizada por una secuencia de fases definidas donde cada etapa debe completarse antes de avanzar a la siguiente, sin retrocesos.</w:t>
+      </w:r>
+    </w:p>
+    <w:p>
+      <w:pPr>
+        <w:spacing w:after="240" w:before="240" w:lineRule="auto"/>
+        <w:rPr/>
+      </w:pPr>
+      <w:r>
+        <w:rPr>
+          <w:rtl w:val="0"/>
+        </w:rPr>
+        <w:t xml:space="preserve">Esta elección se justifica por las características del proyecto: requisitos claros y estables desde el inicio, cliente con una problemática concreta y bien delimitada, y un equipo pequeño de tres integrantes con plazos académicos fijos.</w:t>
+      </w:r>
+    </w:p>
+    <w:p>
+      <w:pPr>
+        <w:spacing w:after="240" w:before="240" w:lineRule="auto"/>
+        <w:rPr/>
+      </w:pPr>
+      <w:r>
+        <w:rPr>
+          <w:rtl w:val="0"/>
+        </w:rPr>
+      </w:r>
+    </w:p>
+    <w:p>
+      <w:pPr>
+        <w:spacing w:after="240" w:before="240" w:lineRule="auto"/>
+        <w:rPr/>
+      </w:pPr>
+      <w:r>
+        <w:rPr>
+          <w:rtl w:val="0"/>
+        </w:rPr>
+      </w:r>
+    </w:p>
+    <w:p>
+      <w:pPr>
+        <w:spacing w:after="240" w:before="240" w:lineRule="auto"/>
+        <w:rPr/>
+      </w:pPr>
+      <w:r>
+        <w:rPr>
+          <w:rtl w:val="0"/>
+        </w:rPr>
+      </w:r>
+    </w:p>
+    <w:p>
+      <w:pPr>
+        <w:spacing w:after="240" w:before="240" w:lineRule="auto"/>
+        <w:rPr/>
+      </w:pPr>
+      <w:r>
+        <w:rPr>
+          <w:rtl w:val="0"/>
+        </w:rPr>
+      </w:r>
+    </w:p>
+    <w:p>
+      <w:pPr>
+        <w:spacing w:after="240" w:before="240" w:lineRule="auto"/>
+        <w:rPr/>
+      </w:pPr>
+      <w:r>
+        <w:rPr>
+          <w:rtl w:val="0"/>
+        </w:rPr>
+      </w:r>
+    </w:p>
+    <w:p>
+      <w:pPr>
+        <w:spacing w:after="240" w:before="240" w:lineRule="auto"/>
+        <w:rPr/>
+      </w:pPr>
+      <w:r>
+        <w:rPr>
+          <w:rtl w:val="0"/>
+        </w:rPr>
+      </w:r>
+    </w:p>
+    <w:p>
+      <w:pPr>
+        <w:pStyle w:val="Heading3"/>
         <w:keepNext w:val="0"/>
         <w:keepLines w:val="0"/>
-        <w:spacing w:after="80" w:lineRule="auto"/>
+        <w:spacing w:after="40" w:before="240" w:lineRule="auto"/>
         <w:rPr>
           <w:b w:val="1"/>
           <w:bCs w:val="1"/>
+          <w:color w:val="000000"/>
+        </w:rPr>
+      </w:pPr>
+      <w:bookmarkStart w:colFirst="0" w:colLast="0" w:name="_a0ts5bho8cwv" w:id="23"/>
+      <w:bookmarkEnd w:id="23"/>
+      <w:r>
+        <w:rPr>
+          <w:b w:val="1"/>
+          <w:bCs w:val="1"/>
+          <w:color w:val="000000"/>
+          <w:rtl w:val="0"/>
+        </w:rPr>
+        <w:t xml:space="preserve">Fases aplicadas</w:t>
+      </w:r>
+    </w:p>
+    <w:tbl>
+      <w:tblPr>
+        <w:tblStyle w:val="Table1"/>
+        <w:tblW w:w="9015.0" w:type="dxa"/>
+        <w:jc w:val="left"/>
+        <w:tblBorders>
+          <w:top w:color="000000" w:space="0" w:sz="8" w:val="single"/>
+          <w:left w:color="000000" w:space="0" w:sz="8" w:val="single"/>
+          <w:bottom w:color="000000" w:space="0" w:sz="8" w:val="single"/>
+          <w:right w:color="000000" w:space="0" w:sz="8" w:val="single"/>
+          <w:insideH w:color="000000" w:space="0" w:sz="8" w:val="single"/>
+          <w:insideV w:color="000000" w:space="0" w:sz="8" w:val="single"/>
+        </w:tblBorders>
+        <w:tblLayout w:type="fixed"/>
+        <w:tblLook w:val="0600"/>
+      </w:tblPr>
+      <w:tblGrid>
+        <w:gridCol w:w="1410"/>
+        <w:gridCol w:w="4635"/>
+        <w:gridCol w:w="2970"/>
+        <w:tblGridChange w:id="0">
+          <w:tblGrid>
+            <w:gridCol w:w="1410"/>
+            <w:gridCol w:w="4635"/>
+            <w:gridCol w:w="2970"/>
+          </w:tblGrid>
+        </w:tblGridChange>
+      </w:tblGrid>
+      <w:tr>
+        <w:trPr>
+          <w:cantSplit w:val="0"/>
+          <w:trHeight w:val="500" w:hRule="atLeast"/>
+          <w:tblHeader w:val="0"/>
+        </w:trPr>
+        <w:tc>
+          <w:tcPr>
+            <w:tcBorders>
+              <w:top w:color="000000" w:space="0" w:sz="8" w:val="single"/>
+              <w:left w:color="000000" w:space="0" w:sz="8" w:val="single"/>
+              <w:bottom w:color="000000" w:space="0" w:sz="8" w:val="single"/>
+              <w:right w:color="000000" w:space="0" w:sz="8" w:val="single"/>
+            </w:tcBorders>
+            <w:tcMar>
+              <w:top w:w="100.0" w:type="dxa"/>
+              <w:left w:w="100.0" w:type="dxa"/>
+              <w:bottom w:w="100.0" w:type="dxa"/>
+              <w:right w:w="100.0" w:type="dxa"/>
+            </w:tcMar>
+            <w:vAlign w:val="top"/>
+          </w:tcPr>
+          <w:p>
+            <w:pPr>
+              <w:spacing w:after="240" w:before="240" w:lineRule="auto"/>
+              <w:jc w:val="center"/>
+              <w:rPr/>
+            </w:pPr>
+            <w:r>
+              <w:rPr>
+                <w:b w:val="1"/>
+                <w:bCs w:val="1"/>
+                <w:rtl w:val="0"/>
+              </w:rPr>
+              <w:t xml:space="preserve">Fase</w:t>
+            </w:r>
+            <w:r>
+              <w:rPr>
+                <w:rtl w:val="0"/>
+              </w:rPr>
+            </w:r>
+          </w:p>
+        </w:tc>
+        <w:tc>
+          <w:tcPr>
+            <w:tcBorders>
+              <w:top w:color="000000" w:space="0" w:sz="8" w:val="single"/>
+              <w:left w:color="000000" w:space="0" w:sz="8" w:val="single"/>
+              <w:bottom w:color="000000" w:space="0" w:sz="8" w:val="single"/>
+              <w:right w:color="000000" w:space="0" w:sz="8" w:val="single"/>
+            </w:tcBorders>
+            <w:tcMar>
+              <w:top w:w="100.0" w:type="dxa"/>
+              <w:left w:w="100.0" w:type="dxa"/>
+              <w:bottom w:w="100.0" w:type="dxa"/>
+              <w:right w:w="100.0" w:type="dxa"/>
+            </w:tcMar>
+            <w:vAlign w:val="top"/>
+          </w:tcPr>
+          <w:p>
+            <w:pPr>
+              <w:spacing w:after="240" w:before="240" w:lineRule="auto"/>
+              <w:jc w:val="center"/>
+              <w:rPr/>
+            </w:pPr>
+            <w:r>
+              <w:rPr>
+                <w:b w:val="1"/>
+                <w:bCs w:val="1"/>
+                <w:rtl w:val="0"/>
+              </w:rPr>
+              <w:t xml:space="preserve">Descripción</w:t>
+            </w:r>
+            <w:r>
+              <w:rPr>
+                <w:rtl w:val="0"/>
+              </w:rPr>
+            </w:r>
+          </w:p>
+        </w:tc>
+        <w:tc>
+          <w:tcPr>
+            <w:tcBorders>
+              <w:top w:color="000000" w:space="0" w:sz="8" w:val="single"/>
+              <w:left w:color="000000" w:space="0" w:sz="8" w:val="single"/>
+              <w:bottom w:color="000000" w:space="0" w:sz="8" w:val="single"/>
+              <w:right w:color="000000" w:space="0" w:sz="8" w:val="single"/>
+            </w:tcBorders>
+            <w:tcMar>
+              <w:top w:w="100.0" w:type="dxa"/>
+              <w:left w:w="100.0" w:type="dxa"/>
+              <w:bottom w:w="100.0" w:type="dxa"/>
+              <w:right w:w="100.0" w:type="dxa"/>
+            </w:tcMar>
+            <w:vAlign w:val="top"/>
+          </w:tcPr>
+          <w:p>
+            <w:pPr>
+              <w:spacing w:after="240" w:before="240" w:lineRule="auto"/>
+              <w:jc w:val="center"/>
+              <w:rPr/>
+            </w:pPr>
+            <w:r>
+              <w:rPr>
+                <w:b w:val="1"/>
+                <w:bCs w:val="1"/>
+                <w:rtl w:val="0"/>
+              </w:rPr>
+              <w:t xml:space="preserve">Hitos</w:t>
+            </w:r>
+            <w:r>
+              <w:rPr>
+                <w:rtl w:val="0"/>
+              </w:rPr>
+            </w:r>
+          </w:p>
+        </w:tc>
+      </w:tr>
+      <w:tr>
+        <w:trPr>
+          <w:cantSplit w:val="0"/>
+          <w:trHeight w:val="1040" w:hRule="atLeast"/>
+          <w:tblHeader w:val="0"/>
+        </w:trPr>
+        <w:tc>
+          <w:tcPr>
+            <w:tcBorders>
+              <w:top w:color="000000" w:space="0" w:sz="8" w:val="single"/>
+              <w:left w:color="000000" w:space="0" w:sz="8" w:val="single"/>
+              <w:bottom w:color="000000" w:space="0" w:sz="8" w:val="single"/>
+              <w:right w:color="000000" w:space="0" w:sz="8" w:val="single"/>
+            </w:tcBorders>
+            <w:tcMar>
+              <w:top w:w="100.0" w:type="dxa"/>
+              <w:left w:w="100.0" w:type="dxa"/>
+              <w:bottom w:w="100.0" w:type="dxa"/>
+              <w:right w:w="100.0" w:type="dxa"/>
+            </w:tcMar>
+            <w:vAlign w:val="top"/>
+          </w:tcPr>
+          <w:p>
+            <w:pPr>
+              <w:spacing w:after="240" w:before="240" w:lineRule="auto"/>
+              <w:rPr/>
+            </w:pPr>
+            <w:r>
+              <w:rPr>
+                <w:rtl w:val="0"/>
+              </w:rPr>
+              <w:t xml:space="preserve">Análisis</w:t>
+            </w:r>
+          </w:p>
+        </w:tc>
+        <w:tc>
+          <w:tcPr>
+            <w:tcBorders>
+              <w:top w:color="000000" w:space="0" w:sz="8" w:val="single"/>
+              <w:left w:color="000000" w:space="0" w:sz="8" w:val="single"/>
+              <w:bottom w:color="000000" w:space="0" w:sz="8" w:val="single"/>
+              <w:right w:color="000000" w:space="0" w:sz="8" w:val="single"/>
+            </w:tcBorders>
+            <w:tcMar>
+              <w:top w:w="100.0" w:type="dxa"/>
+              <w:left w:w="100.0" w:type="dxa"/>
+              <w:bottom w:w="100.0" w:type="dxa"/>
+              <w:right w:w="100.0" w:type="dxa"/>
+            </w:tcMar>
+            <w:vAlign w:val="top"/>
+          </w:tcPr>
+          <w:p>
+            <w:pPr>
+              <w:spacing w:after="240" w:before="240" w:lineRule="auto"/>
+              <w:rPr/>
+            </w:pPr>
+            <w:r>
+              <w:rPr>
+                <w:rtl w:val="0"/>
+              </w:rPr>
+              <w:t xml:space="preserve">Levantamiento de requisitos con Input Medical. Identificación del problema, alcance y requerimientos funcionales.</w:t>
+            </w:r>
+          </w:p>
+        </w:tc>
+        <w:tc>
+          <w:tcPr>
+            <w:tcBorders>
+              <w:top w:color="000000" w:space="0" w:sz="8" w:val="single"/>
+              <w:left w:color="000000" w:space="0" w:sz="8" w:val="single"/>
+              <w:bottom w:color="000000" w:space="0" w:sz="8" w:val="single"/>
+              <w:right w:color="000000" w:space="0" w:sz="8" w:val="single"/>
+            </w:tcBorders>
+            <w:tcMar>
+              <w:top w:w="100.0" w:type="dxa"/>
+              <w:left w:w="100.0" w:type="dxa"/>
+              <w:bottom w:w="100.0" w:type="dxa"/>
+              <w:right w:w="100.0" w:type="dxa"/>
+            </w:tcMar>
+            <w:vAlign w:val="top"/>
+          </w:tcPr>
+          <w:p>
+            <w:pPr>
+              <w:spacing w:after="240" w:before="240" w:lineRule="auto"/>
+              <w:rPr/>
+            </w:pPr>
+            <w:r>
+              <w:rPr>
+                <w:rtl w:val="0"/>
+              </w:rPr>
+              <w:t xml:space="preserve">Matriz de trazabilidad, casos de uso</w:t>
+            </w:r>
+          </w:p>
+        </w:tc>
+      </w:tr>
+      <w:tr>
+        <w:trPr>
+          <w:cantSplit w:val="0"/>
+          <w:trHeight w:val="1040" w:hRule="atLeast"/>
+          <w:tblHeader w:val="0"/>
+        </w:trPr>
+        <w:tc>
+          <w:tcPr>
+            <w:tcBorders>
+              <w:top w:color="000000" w:space="0" w:sz="8" w:val="single"/>
+              <w:left w:color="000000" w:space="0" w:sz="8" w:val="single"/>
+              <w:bottom w:color="000000" w:space="0" w:sz="8" w:val="single"/>
+              <w:right w:color="000000" w:space="0" w:sz="8" w:val="single"/>
+            </w:tcBorders>
+            <w:tcMar>
+              <w:top w:w="100.0" w:type="dxa"/>
+              <w:left w:w="100.0" w:type="dxa"/>
+              <w:bottom w:w="100.0" w:type="dxa"/>
+              <w:right w:w="100.0" w:type="dxa"/>
+            </w:tcMar>
+            <w:vAlign w:val="top"/>
+          </w:tcPr>
+          <w:p>
+            <w:pPr>
+              <w:spacing w:after="240" w:before="240" w:lineRule="auto"/>
+              <w:rPr/>
+            </w:pPr>
+            <w:r>
+              <w:rPr>
+                <w:rtl w:val="0"/>
+              </w:rPr>
+              <w:t xml:space="preserve">Diseño</w:t>
+            </w:r>
+          </w:p>
+        </w:tc>
+        <w:tc>
+          <w:tcPr>
+            <w:tcBorders>
+              <w:top w:color="000000" w:space="0" w:sz="8" w:val="single"/>
+              <w:left w:color="000000" w:space="0" w:sz="8" w:val="single"/>
+              <w:bottom w:color="000000" w:space="0" w:sz="8" w:val="single"/>
+              <w:right w:color="000000" w:space="0" w:sz="8" w:val="single"/>
+            </w:tcBorders>
+            <w:tcMar>
+              <w:top w:w="100.0" w:type="dxa"/>
+              <w:left w:w="100.0" w:type="dxa"/>
+              <w:bottom w:w="100.0" w:type="dxa"/>
+              <w:right w:w="100.0" w:type="dxa"/>
+            </w:tcMar>
+            <w:vAlign w:val="top"/>
+          </w:tcPr>
+          <w:p>
+            <w:pPr>
+              <w:spacing w:after="240" w:before="240" w:lineRule="auto"/>
+              <w:rPr/>
+            </w:pPr>
+            <w:r>
+              <w:rPr>
+                <w:rtl w:val="0"/>
+              </w:rPr>
+              <w:t xml:space="preserve">Definición de arquitectura, tecnologías, modelo de datos y flujos del sistema.</w:t>
+            </w:r>
+          </w:p>
+        </w:tc>
+        <w:tc>
+          <w:tcPr>
+            <w:tcBorders>
+              <w:top w:color="000000" w:space="0" w:sz="8" w:val="single"/>
+              <w:left w:color="000000" w:space="0" w:sz="8" w:val="single"/>
+              <w:bottom w:color="000000" w:space="0" w:sz="8" w:val="single"/>
+              <w:right w:color="000000" w:space="0" w:sz="8" w:val="single"/>
+            </w:tcBorders>
+            <w:tcMar>
+              <w:top w:w="100.0" w:type="dxa"/>
+              <w:left w:w="100.0" w:type="dxa"/>
+              <w:bottom w:w="100.0" w:type="dxa"/>
+              <w:right w:w="100.0" w:type="dxa"/>
+            </w:tcMar>
+            <w:vAlign w:val="top"/>
+          </w:tcPr>
+          <w:p>
+            <w:pPr>
+              <w:spacing w:after="240" w:before="240" w:lineRule="auto"/>
+              <w:rPr/>
+            </w:pPr>
+            <w:r>
+              <w:rPr>
+                <w:rtl w:val="0"/>
+              </w:rPr>
+              <w:t xml:space="preserve">Diagrama DER, diagrama de secuencia, diagrama de flujo, carta Gantt</w:t>
+            </w:r>
+          </w:p>
+        </w:tc>
+      </w:tr>
+      <w:tr>
+        <w:trPr>
+          <w:cantSplit w:val="0"/>
+          <w:trHeight w:val="1040" w:hRule="atLeast"/>
+          <w:tblHeader w:val="0"/>
+        </w:trPr>
+        <w:tc>
+          <w:tcPr>
+            <w:tcBorders>
+              <w:top w:color="000000" w:space="0" w:sz="8" w:val="single"/>
+              <w:left w:color="000000" w:space="0" w:sz="8" w:val="single"/>
+              <w:bottom w:color="000000" w:space="0" w:sz="8" w:val="single"/>
+              <w:right w:color="000000" w:space="0" w:sz="8" w:val="single"/>
+            </w:tcBorders>
+            <w:tcMar>
+              <w:top w:w="100.0" w:type="dxa"/>
+              <w:left w:w="100.0" w:type="dxa"/>
+              <w:bottom w:w="100.0" w:type="dxa"/>
+              <w:right w:w="100.0" w:type="dxa"/>
+            </w:tcMar>
+            <w:vAlign w:val="top"/>
+          </w:tcPr>
+          <w:p>
+            <w:pPr>
+              <w:spacing w:after="240" w:before="240" w:lineRule="auto"/>
+              <w:rPr/>
+            </w:pPr>
+            <w:r>
+              <w:rPr>
+                <w:rtl w:val="0"/>
+              </w:rPr>
+              <w:t xml:space="preserve">Desarrollo</w:t>
+            </w:r>
+          </w:p>
+        </w:tc>
+        <w:tc>
+          <w:tcPr>
+            <w:tcBorders>
+              <w:top w:color="000000" w:space="0" w:sz="8" w:val="single"/>
+              <w:left w:color="000000" w:space="0" w:sz="8" w:val="single"/>
+              <w:bottom w:color="000000" w:space="0" w:sz="8" w:val="single"/>
+              <w:right w:color="000000" w:space="0" w:sz="8" w:val="single"/>
+            </w:tcBorders>
+            <w:tcMar>
+              <w:top w:w="100.0" w:type="dxa"/>
+              <w:left w:w="100.0" w:type="dxa"/>
+              <w:bottom w:w="100.0" w:type="dxa"/>
+              <w:right w:w="100.0" w:type="dxa"/>
+            </w:tcMar>
+            <w:vAlign w:val="top"/>
+          </w:tcPr>
+          <w:p>
+            <w:pPr>
+              <w:spacing w:after="240" w:before="240" w:lineRule="auto"/>
+              <w:rPr/>
+            </w:pPr>
+            <w:r>
+              <w:rPr>
+                <w:rtl w:val="0"/>
+              </w:rPr>
+              <w:t xml:space="preserve">Implementación del sistema por módulos: autenticación, productos, movimientos FIFO, alertas, reportes y gestión de usuarios.</w:t>
+            </w:r>
+          </w:p>
+        </w:tc>
+        <w:tc>
+          <w:tcPr>
+            <w:tcBorders>
+              <w:top w:color="000000" w:space="0" w:sz="8" w:val="single"/>
+              <w:left w:color="000000" w:space="0" w:sz="8" w:val="single"/>
+              <w:bottom w:color="000000" w:space="0" w:sz="8" w:val="single"/>
+              <w:right w:color="000000" w:space="0" w:sz="8" w:val="single"/>
+            </w:tcBorders>
+            <w:tcMar>
+              <w:top w:w="100.0" w:type="dxa"/>
+              <w:left w:w="100.0" w:type="dxa"/>
+              <w:bottom w:w="100.0" w:type="dxa"/>
+              <w:right w:w="100.0" w:type="dxa"/>
+            </w:tcMar>
+            <w:vAlign w:val="top"/>
+          </w:tcPr>
+          <w:p>
+            <w:pPr>
+              <w:spacing w:after="240" w:before="240" w:lineRule="auto"/>
+              <w:rPr/>
+            </w:pPr>
+            <w:r>
+              <w:rPr>
+                <w:rtl w:val="0"/>
+              </w:rPr>
+              <w:t xml:space="preserve">Código fuente versionado en GitHub</w:t>
+            </w:r>
+          </w:p>
+        </w:tc>
+      </w:tr>
+      <w:tr>
+        <w:trPr>
+          <w:cantSplit w:val="0"/>
+          <w:trHeight w:val="1040" w:hRule="atLeast"/>
+          <w:tblHeader w:val="0"/>
+        </w:trPr>
+        <w:tc>
+          <w:tcPr>
+            <w:tcBorders>
+              <w:top w:color="000000" w:space="0" w:sz="8" w:val="single"/>
+              <w:left w:color="000000" w:space="0" w:sz="8" w:val="single"/>
+              <w:bottom w:color="000000" w:space="0" w:sz="8" w:val="single"/>
+              <w:right w:color="000000" w:space="0" w:sz="8" w:val="single"/>
+            </w:tcBorders>
+            <w:tcMar>
+              <w:top w:w="100.0" w:type="dxa"/>
+              <w:left w:w="100.0" w:type="dxa"/>
+              <w:bottom w:w="100.0" w:type="dxa"/>
+              <w:right w:w="100.0" w:type="dxa"/>
+            </w:tcMar>
+            <w:vAlign w:val="top"/>
+          </w:tcPr>
+          <w:p>
+            <w:pPr>
+              <w:spacing w:after="240" w:before="240" w:lineRule="auto"/>
+              <w:rPr/>
+            </w:pPr>
+            <w:r>
+              <w:rPr>
+                <w:rtl w:val="0"/>
+              </w:rPr>
+              <w:t xml:space="preserve">Pruebas</w:t>
+            </w:r>
+          </w:p>
+        </w:tc>
+        <w:tc>
+          <w:tcPr>
+            <w:tcBorders>
+              <w:top w:color="000000" w:space="0" w:sz="8" w:val="single"/>
+              <w:left w:color="000000" w:space="0" w:sz="8" w:val="single"/>
+              <w:bottom w:color="000000" w:space="0" w:sz="8" w:val="single"/>
+              <w:right w:color="000000" w:space="0" w:sz="8" w:val="single"/>
+            </w:tcBorders>
+            <w:tcMar>
+              <w:top w:w="100.0" w:type="dxa"/>
+              <w:left w:w="100.0" w:type="dxa"/>
+              <w:bottom w:w="100.0" w:type="dxa"/>
+              <w:right w:w="100.0" w:type="dxa"/>
+            </w:tcMar>
+            <w:vAlign w:val="top"/>
+          </w:tcPr>
+          <w:p>
+            <w:pPr>
+              <w:spacing w:after="240" w:before="240" w:lineRule="auto"/>
+              <w:rPr/>
+            </w:pPr>
+            <w:r>
+              <w:rPr>
+                <w:rtl w:val="0"/>
+              </w:rPr>
+              <w:t xml:space="preserve">Verificación funcional de cada módulo implementado contra los requerimientos definidos.</w:t>
+            </w:r>
+          </w:p>
+        </w:tc>
+        <w:tc>
+          <w:tcPr>
+            <w:tcBorders>
+              <w:top w:color="000000" w:space="0" w:sz="8" w:val="single"/>
+              <w:left w:color="000000" w:space="0" w:sz="8" w:val="single"/>
+              <w:bottom w:color="000000" w:space="0" w:sz="8" w:val="single"/>
+              <w:right w:color="000000" w:space="0" w:sz="8" w:val="single"/>
+            </w:tcBorders>
+            <w:tcMar>
+              <w:top w:w="100.0" w:type="dxa"/>
+              <w:left w:w="100.0" w:type="dxa"/>
+              <w:bottom w:w="100.0" w:type="dxa"/>
+              <w:right w:w="100.0" w:type="dxa"/>
+            </w:tcMar>
+            <w:vAlign w:val="top"/>
+          </w:tcPr>
+          <w:p>
+            <w:pPr>
+              <w:spacing w:after="240" w:before="240" w:lineRule="auto"/>
+              <w:rPr/>
+            </w:pPr>
+            <w:r>
+              <w:rPr>
+                <w:rtl w:val="0"/>
+              </w:rPr>
+              <w:t xml:space="preserve">Plan de pruebas</w:t>
+            </w:r>
+          </w:p>
+        </w:tc>
+      </w:tr>
+      <w:tr>
+        <w:trPr>
+          <w:cantSplit w:val="0"/>
+          <w:trHeight w:val="770" w:hRule="atLeast"/>
+          <w:tblHeader w:val="0"/>
+        </w:trPr>
+        <w:tc>
+          <w:tcPr>
+            <w:tcBorders>
+              <w:top w:color="000000" w:space="0" w:sz="8" w:val="single"/>
+              <w:left w:color="000000" w:space="0" w:sz="8" w:val="single"/>
+              <w:bottom w:color="000000" w:space="0" w:sz="8" w:val="single"/>
+              <w:right w:color="000000" w:space="0" w:sz="8" w:val="single"/>
+            </w:tcBorders>
+            <w:tcMar>
+              <w:top w:w="100.0" w:type="dxa"/>
+              <w:left w:w="100.0" w:type="dxa"/>
+              <w:bottom w:w="100.0" w:type="dxa"/>
+              <w:right w:w="100.0" w:type="dxa"/>
+            </w:tcMar>
+            <w:vAlign w:val="top"/>
+          </w:tcPr>
+          <w:p>
+            <w:pPr>
+              <w:spacing w:after="240" w:before="240" w:lineRule="auto"/>
+              <w:rPr/>
+            </w:pPr>
+            <w:r>
+              <w:rPr>
+                <w:rtl w:val="0"/>
+              </w:rPr>
+              <w:t xml:space="preserve">Despliegue</w:t>
+            </w:r>
+          </w:p>
+        </w:tc>
+        <w:tc>
+          <w:tcPr>
+            <w:tcBorders>
+              <w:top w:color="000000" w:space="0" w:sz="8" w:val="single"/>
+              <w:left w:color="000000" w:space="0" w:sz="8" w:val="single"/>
+              <w:bottom w:color="000000" w:space="0" w:sz="8" w:val="single"/>
+              <w:right w:color="000000" w:space="0" w:sz="8" w:val="single"/>
+            </w:tcBorders>
+            <w:tcMar>
+              <w:top w:w="100.0" w:type="dxa"/>
+              <w:left w:w="100.0" w:type="dxa"/>
+              <w:bottom w:w="100.0" w:type="dxa"/>
+              <w:right w:w="100.0" w:type="dxa"/>
+            </w:tcMar>
+            <w:vAlign w:val="top"/>
+          </w:tcPr>
+          <w:p>
+            <w:pPr>
+              <w:spacing w:after="240" w:before="240" w:lineRule="auto"/>
+              <w:rPr/>
+            </w:pPr>
+            <w:r>
+              <w:rPr>
+                <w:rtl w:val="0"/>
+              </w:rPr>
+              <w:t xml:space="preserve">Publicación del frontend en Vercel.</w:t>
+            </w:r>
+          </w:p>
+        </w:tc>
+        <w:tc>
+          <w:tcPr>
+            <w:tcBorders>
+              <w:top w:color="000000" w:space="0" w:sz="8" w:val="single"/>
+              <w:left w:color="000000" w:space="0" w:sz="8" w:val="single"/>
+              <w:bottom w:color="000000" w:space="0" w:sz="8" w:val="single"/>
+              <w:right w:color="000000" w:space="0" w:sz="8" w:val="single"/>
+            </w:tcBorders>
+            <w:tcMar>
+              <w:top w:w="100.0" w:type="dxa"/>
+              <w:left w:w="100.0" w:type="dxa"/>
+              <w:bottom w:w="100.0" w:type="dxa"/>
+              <w:right w:w="100.0" w:type="dxa"/>
+            </w:tcMar>
+            <w:vAlign w:val="top"/>
+          </w:tcPr>
+          <w:p>
+            <w:pPr>
+              <w:spacing w:after="240" w:before="240" w:lineRule="auto"/>
+              <w:rPr/>
+            </w:pPr>
+            <w:r>
+              <w:rPr>
+                <w:rtl w:val="0"/>
+              </w:rPr>
+              <w:t xml:space="preserve">Sistema en producción</w:t>
+            </w:r>
+          </w:p>
+        </w:tc>
+      </w:tr>
+    </w:tbl>
+    <w:p>
+      <w:pPr>
+        <w:spacing w:after="240" w:before="240" w:lineRule="auto"/>
+        <w:rPr/>
+      </w:pPr>
+      <w:r>
+        <w:rPr>
+          <w:rtl w:val="0"/>
+        </w:rPr>
+      </w:r>
+    </w:p>
+    <w:p>
+      <w:pPr>
+        <w:pStyle w:val="Heading4"/>
+        <w:keepNext w:val="0"/>
+        <w:keepLines w:val="0"/>
+        <w:spacing w:after="40" w:before="240" w:lineRule="auto"/>
+        <w:rPr>
+          <w:b w:val="1"/>
+          <w:bCs w:val="1"/>
+          <w:color w:val="000000"/>
           <w:sz w:val="22"/>
           <w:szCs w:val="22"/>
         </w:rPr>
       </w:pPr>
-      <w:bookmarkStart w:colFirst="0" w:colLast="0" w:name="_a0gkkbaebyfw" w:id="19"/>
-      <w:bookmarkEnd w:id="19"/>
+      <w:bookmarkStart w:colFirst="0" w:colLast="0" w:name="_bz2wufvsit6p" w:id="24"/>
+      <w:bookmarkEnd w:id="24"/>
       <w:r>
         <w:rPr>
           <w:b w:val="1"/>
           <w:bCs w:val="1"/>
+          <w:color w:val="000000"/>
           <w:sz w:val="22"/>
           <w:szCs w:val="22"/>
           <w:rtl w:val="0"/>
         </w:rPr>
-        <w:t xml:space="preserve">Justificación:</w:t>
+        <w:t xml:space="preserve">Planificación</w:t>
       </w:r>
     </w:p>
     <w:p>
@@ -4280,7 +5520,47 @@
         <w:rPr>
           <w:rtl w:val="0"/>
         </w:rPr>
-        <w:t xml:space="preserve">El uso de servicios cloud permite:</w:t>
+        <w:t xml:space="preserve">La planificación se formalizó mediante una carta Gantt que abarca desde finales de marzo hasta la primera semana de julio de 2026, distribuyendo las fases de forma secuencial con revisiones periódicas al final de cada etapa. Al completar cada revisión satisfactoriamente, el equipo avanzó a la fase siguiente sin retroceder a etapas anteriores.</w:t>
+      </w:r>
+    </w:p>
+    <w:p>
+      <w:pPr>
+        <w:pStyle w:val="Heading4"/>
+        <w:keepNext w:val="0"/>
+        <w:keepLines w:val="0"/>
+        <w:spacing w:after="40" w:before="240" w:lineRule="auto"/>
+        <w:rPr>
+          <w:b w:val="1"/>
+          <w:bCs w:val="1"/>
+          <w:color w:val="000000"/>
+          <w:sz w:val="22"/>
+          <w:szCs w:val="22"/>
+        </w:rPr>
+      </w:pPr>
+      <w:bookmarkStart w:colFirst="0" w:colLast="0" w:name="_1dgfcmyfmvv7" w:id="25"/>
+      <w:bookmarkEnd w:id="25"/>
+      <w:r>
+        <w:rPr>
+          <w:b w:val="1"/>
+          <w:bCs w:val="1"/>
+          <w:color w:val="000000"/>
+          <w:sz w:val="22"/>
+          <w:szCs w:val="22"/>
+          <w:rtl w:val="0"/>
+        </w:rPr>
+        <w:t xml:space="preserve">Justificación de la elección</w:t>
+      </w:r>
+    </w:p>
+    <w:p>
+      <w:pPr>
+        <w:spacing w:after="240" w:before="240" w:lineRule="auto"/>
+        <w:rPr/>
+      </w:pPr>
+      <w:r>
+        <w:rPr>
+          <w:rtl w:val="0"/>
+        </w:rPr>
+        <w:t xml:space="preserve">La metodología en cascada fue seleccionada por sobre metodologías ágiles debido a que:</w:t>
       </w:r>
     </w:p>
     <w:p>
@@ -4291,13 +5571,12 @@
         </w:numPr>
         <w:spacing w:after="0" w:afterAutospacing="0" w:before="240" w:lineRule="auto"/>
         <w:ind w:left="720" w:hanging="360"/>
-        <w:rPr/>
-      </w:pPr>
-      <w:r>
-        <w:rPr>
-          <w:rtl w:val="0"/>
-        </w:rPr>
-        <w:t xml:space="preserve">Disponibilidad del sistema en tiempo real</w:t>
+      </w:pPr>
+      <w:r>
+        <w:rPr>
+          <w:rtl w:val="0"/>
+        </w:rPr>
+        <w:t xml:space="preserve">Los requisitos del cliente fueron identificados y estabilizados desde el inicio del proyecto.</w:t>
       </w:r>
     </w:p>
     <w:p>
@@ -4308,13 +5587,12 @@
         </w:numPr>
         <w:spacing w:after="0" w:afterAutospacing="0" w:before="0" w:beforeAutospacing="0" w:lineRule="auto"/>
         <w:ind w:left="720" w:hanging="360"/>
-        <w:rPr/>
-      </w:pPr>
-      <w:r>
-        <w:rPr>
-          <w:rtl w:val="0"/>
-        </w:rPr>
-        <w:t xml:space="preserve">Reducción de costos en infraestructura</w:t>
+      </w:pPr>
+      <w:r>
+        <w:rPr>
+          <w:rtl w:val="0"/>
+        </w:rPr>
+        <w:t xml:space="preserve">El alcance del sistema estaba claramente delimitado, sin cambios significativos esperados durante el desarrollo.</w:t>
       </w:r>
     </w:p>
     <w:p>
@@ -4325,13 +5603,12 @@
         </w:numPr>
         <w:spacing w:after="0" w:afterAutospacing="0" w:before="0" w:beforeAutospacing="0" w:lineRule="auto"/>
         <w:ind w:left="720" w:hanging="360"/>
-        <w:rPr/>
-      </w:pPr>
-      <w:r>
-        <w:rPr>
-          <w:rtl w:val="0"/>
-        </w:rPr>
-        <w:t xml:space="preserve">Escalabilidad según el crecimiento del negocio</w:t>
+      </w:pPr>
+      <w:r>
+        <w:rPr>
+          <w:rtl w:val="0"/>
+        </w:rPr>
+        <w:t xml:space="preserve">La carta Gantt permitió una distribución ordenada del trabajo entre los tres integrantes del equipo.</w:t>
       </w:r>
     </w:p>
     <w:p>
@@ -4342,49 +5619,40 @@
         </w:numPr>
         <w:spacing w:after="240" w:before="0" w:beforeAutospacing="0" w:lineRule="auto"/>
         <w:ind w:left="720" w:hanging="360"/>
-        <w:rPr/>
-      </w:pPr>
-      <w:r>
-        <w:rPr>
-          <w:rtl w:val="0"/>
-        </w:rPr>
-        <w:t xml:space="preserve">Mayor seguridad en el almacenamiento de datos</w:t>
+      </w:pPr>
+      <w:r>
+        <w:rPr>
+          <w:rtl w:val="0"/>
+        </w:rPr>
+        <w:t xml:space="preserve">El contexto académico exigía entregas formales por etapas, lo que es coherente con el modelo en cascada.</w:t>
       </w:r>
     </w:p>
     <w:p>
       <w:pPr>
         <w:spacing w:after="240" w:before="240" w:lineRule="auto"/>
-        <w:rPr>
-          <w:b w:val="1"/>
-          <w:bCs w:val="1"/>
-          <w:sz w:val="22"/>
-          <w:szCs w:val="22"/>
-        </w:rPr>
-      </w:pPr>
-      <w:r>
-        <w:rPr>
-          <w:rtl w:val="0"/>
-        </w:rPr>
-        <w:t xml:space="preserve">En conjunto, la adopción de estos modelos permite implementar una solución moderna, eficiente y alineada con las prácticas actuales de desarrollo de software en la nube.</w:t>
-      </w:r>
-      <w:r>
-        <w:rPr>
-          <w:rtl w:val="0"/>
-        </w:rPr>
-      </w:r>
-    </w:p>
-    <w:p>
-      <w:pPr>
-        <w:pStyle w:val="Heading1"/>
-        <w:rPr>
-          <w:b w:val="1"/>
-          <w:bCs w:val="1"/>
-          <w:sz w:val="22"/>
-          <w:szCs w:val="22"/>
-        </w:rPr>
-      </w:pPr>
-      <w:bookmarkStart w:colFirst="0" w:colLast="0" w:name="_xbevc14wn4is" w:id="20"/>
-      <w:bookmarkEnd w:id="20"/>
+        <w:rPr/>
+      </w:pPr>
+      <w:r>
+        <w:rPr>
+          <w:rtl w:val="0"/>
+        </w:rPr>
+      </w:r>
+    </w:p>
+    <w:p>
+      <w:pPr>
+        <w:rPr/>
+      </w:pPr>
+      <w:r>
+        <w:rPr>
+          <w:rtl w:val="0"/>
+        </w:rPr>
+      </w:r>
+    </w:p>
+    <w:p>
+      <w:pPr>
+        <w:spacing w:after="240" w:before="240" w:lineRule="auto"/>
+        <w:rPr/>
+      </w:pPr>
       <w:r>
         <w:rPr>
           <w:rtl w:val="0"/>
@@ -4401,8 +5669,8 @@
           <w:szCs w:val="28"/>
         </w:rPr>
       </w:pPr>
-      <w:bookmarkStart w:colFirst="0" w:colLast="0" w:name="_fy0rcpeymfkg" w:id="21"/>
-      <w:bookmarkEnd w:id="21"/>
+      <w:bookmarkStart w:colFirst="0" w:colLast="0" w:name="_ggpne0y61xeh" w:id="26"/>
+      <w:bookmarkEnd w:id="26"/>
       <w:r>
         <w:rPr>
           <w:b w:val="1"/>
@@ -4411,322 +5679,17 @@
           <w:szCs w:val="28"/>
           <w:rtl w:val="0"/>
         </w:rPr>
-        <w:t xml:space="preserve">8. Conceptualización</w:t>
-      </w:r>
-    </w:p>
-    <w:p>
-      <w:pPr>
-        <w:rPr/>
-      </w:pPr>
-      <w:r>
-        <w:rPr>
-          <w:rtl w:val="0"/>
-        </w:rPr>
-      </w:r>
-    </w:p>
-    <w:p>
-      <w:pPr>
-        <w:spacing w:after="240" w:before="240" w:lineRule="auto"/>
-        <w:rPr/>
-      </w:pPr>
-      <w:r>
-        <w:rPr>
-          <w:rtl w:val="0"/>
-        </w:rPr>
-        <w:t xml:space="preserve">Para garantizar que la solución sea viable y profesional, se han definido los siguientes atributos de calidad basados en el estándar </w:t>
-      </w:r>
-      <w:r>
-        <w:rPr>
-          <w:b w:val="1"/>
-          <w:bCs w:val="1"/>
-          <w:rtl w:val="0"/>
-        </w:rPr>
-        <w:t xml:space="preserve">ISO/IEC 25010</w:t>
-      </w:r>
-      <w:r>
-        <w:rPr>
-          <w:rtl w:val="0"/>
-        </w:rPr>
-        <w:t xml:space="preserve">:</w:t>
-      </w:r>
-    </w:p>
-    <w:p>
-      <w:pPr>
-        <w:numPr>
-          <w:ilvl w:val="0"/>
-          <w:numId w:val="1"/>
-        </w:numPr>
-        <w:spacing w:after="0" w:afterAutospacing="0" w:before="240" w:lineRule="auto"/>
-        <w:ind w:left="720" w:hanging="360"/>
-        <w:rPr/>
-      </w:pPr>
-      <w:r>
-        <w:rPr>
-          <w:b w:val="1"/>
-          <w:bCs w:val="1"/>
-          <w:rtl w:val="0"/>
-        </w:rPr>
-        <w:t xml:space="preserve">Integridad:</w:t>
-      </w:r>
-      <w:r>
-        <w:rPr>
-          <w:rtl w:val="0"/>
-        </w:rPr>
-        <w:t xml:space="preserve"> Se asegura mediante el uso de </w:t>
-      </w:r>
-      <w:r>
-        <w:rPr>
-          <w:b w:val="1"/>
-          <w:bCs w:val="1"/>
-          <w:rtl w:val="0"/>
-        </w:rPr>
-        <w:t xml:space="preserve">restricciones (constraints)</w:t>
-      </w:r>
-      <w:r>
-        <w:rPr>
-          <w:rtl w:val="0"/>
-        </w:rPr>
-        <w:t xml:space="preserve"> en la base de datos PostgreSQL y el uso de </w:t>
-      </w:r>
-      <w:r>
-        <w:rPr>
-          <w:b w:val="1"/>
-          <w:bCs w:val="1"/>
-          <w:rtl w:val="0"/>
-        </w:rPr>
-        <w:t xml:space="preserve">transacciones</w:t>
-      </w:r>
-      <w:r>
-        <w:rPr>
-          <w:rtl w:val="0"/>
-        </w:rPr>
-        <w:t xml:space="preserve">. Esto garantiza que si una entrada de inventario falla a mitad de camino, los datos no queden corruptos ni parciales.</w:t>
-      </w:r>
-    </w:p>
-    <w:p>
-      <w:pPr>
-        <w:numPr>
-          <w:ilvl w:val="0"/>
-          <w:numId w:val="1"/>
-        </w:numPr>
-        <w:spacing w:after="0" w:afterAutospacing="0" w:before="0" w:beforeAutospacing="0" w:lineRule="auto"/>
-        <w:ind w:left="720" w:hanging="360"/>
-        <w:rPr/>
-      </w:pPr>
-      <w:r>
-        <w:rPr>
-          <w:b w:val="1"/>
-          <w:bCs w:val="1"/>
-          <w:rtl w:val="0"/>
-        </w:rPr>
-        <w:t xml:space="preserve">Confiabilidad:</w:t>
-      </w:r>
-      <w:r>
-        <w:rPr>
-          <w:rtl w:val="0"/>
-        </w:rPr>
-        <w:t xml:space="preserve"> Al utilizar una infraestructura </w:t>
-      </w:r>
-      <w:r>
-        <w:rPr>
-          <w:b w:val="1"/>
-          <w:bCs w:val="1"/>
-          <w:rtl w:val="0"/>
-        </w:rPr>
-        <w:t xml:space="preserve">PaaS (Supabase)</w:t>
-      </w:r>
-      <w:r>
-        <w:rPr>
-          <w:rtl w:val="0"/>
-        </w:rPr>
-        <w:t xml:space="preserve">, el sistema hereda una disponibilidad del 99.9%. La lógica FIFO está programada a nivel de base de datos para asegurar que el cálculo de vencimientos sea siempre consistente.</w:t>
-      </w:r>
-    </w:p>
-    <w:p>
-      <w:pPr>
-        <w:numPr>
-          <w:ilvl w:val="0"/>
-          <w:numId w:val="1"/>
-        </w:numPr>
-        <w:spacing w:after="0" w:afterAutospacing="0" w:before="0" w:beforeAutospacing="0" w:lineRule="auto"/>
-        <w:ind w:left="720" w:hanging="360"/>
-        <w:rPr/>
-      </w:pPr>
-      <w:r>
-        <w:rPr>
-          <w:b w:val="1"/>
-          <w:bCs w:val="1"/>
-          <w:rtl w:val="0"/>
-        </w:rPr>
-        <w:t xml:space="preserve">Precisión (Nivel de detalle):</w:t>
-      </w:r>
-      <w:r>
-        <w:rPr>
-          <w:rtl w:val="0"/>
-        </w:rPr>
-        <w:t xml:space="preserve"> La información entregada responde exactamente a los requerimientos del cliente mediante un modelo de datos que registra: SKU, lote, fecha de vencimiento exacta, usuario que realizó el movimiento y marca de tiempo (timestamp). Esto elimina la ambigüedad de las planillas Excel.</w:t>
-      </w:r>
-    </w:p>
-    <w:p>
-      <w:pPr>
-        <w:numPr>
-          <w:ilvl w:val="0"/>
-          <w:numId w:val="1"/>
-        </w:numPr>
-        <w:spacing w:after="0" w:afterAutospacing="0" w:before="0" w:beforeAutospacing="0" w:lineRule="auto"/>
-        <w:ind w:left="720" w:hanging="360"/>
-        <w:rPr/>
-      </w:pPr>
-      <w:r>
-        <w:rPr>
-          <w:b w:val="1"/>
-          <w:bCs w:val="1"/>
-          <w:rtl w:val="0"/>
-        </w:rPr>
-        <w:t xml:space="preserve">Oportunidad:</w:t>
-      </w:r>
-      <w:r>
-        <w:rPr>
-          <w:rtl w:val="0"/>
-        </w:rPr>
-        <w:t xml:space="preserve"> El sistema garantiza que la información sea </w:t>
-      </w:r>
-      <w:r>
-        <w:rPr>
-          <w:b w:val="1"/>
-          <w:bCs w:val="1"/>
-          <w:rtl w:val="0"/>
-        </w:rPr>
-        <w:t xml:space="preserve">síncrona</w:t>
-      </w:r>
-      <w:r>
-        <w:rPr>
-          <w:rtl w:val="0"/>
-        </w:rPr>
-        <w:t xml:space="preserve">. Gracias a las suscripciones de Supabase (Realtime), cualquier egreso de producto se refleja en el panel de control de forma inmediata, permitiendo una toma de decisiones basada en el stock real del momento.</w:t>
-      </w:r>
-    </w:p>
-    <w:p>
-      <w:pPr>
-        <w:numPr>
-          <w:ilvl w:val="0"/>
-          <w:numId w:val="1"/>
-        </w:numPr>
-        <w:spacing w:after="0" w:afterAutospacing="0" w:before="0" w:beforeAutospacing="0" w:lineRule="auto"/>
-        <w:ind w:left="720" w:hanging="360"/>
-        <w:rPr/>
-      </w:pPr>
-      <w:r>
-        <w:rPr>
-          <w:b w:val="1"/>
-          <w:bCs w:val="1"/>
-          <w:rtl w:val="0"/>
-        </w:rPr>
-        <w:t xml:space="preserve">Seguridad:</w:t>
-      </w:r>
-      <w:r>
-        <w:rPr>
-          <w:rtl w:val="0"/>
-        </w:rPr>
-        <w:t xml:space="preserve"> Se implementa un modelo de seguridad robusto basado en:</w:t>
-      </w:r>
-    </w:p>
-    <w:p>
-      <w:pPr>
-        <w:numPr>
-          <w:ilvl w:val="1"/>
-          <w:numId w:val="1"/>
-        </w:numPr>
-        <w:spacing w:after="0" w:afterAutospacing="0" w:before="0" w:beforeAutospacing="0" w:lineRule="auto"/>
-        <w:ind w:left="1440" w:hanging="360"/>
-        <w:rPr/>
-      </w:pPr>
-      <w:r>
-        <w:rPr>
-          <w:b w:val="1"/>
-          <w:bCs w:val="1"/>
-          <w:rtl w:val="0"/>
-        </w:rPr>
-        <w:t xml:space="preserve">Autenticación:</w:t>
-      </w:r>
-      <w:r>
-        <w:rPr>
-          <w:rtl w:val="0"/>
-        </w:rPr>
-        <w:t xml:space="preserve"> Gestión de usuarios mediante JWT (JSON Web Tokens).</w:t>
-      </w:r>
-    </w:p>
-    <w:p>
-      <w:pPr>
-        <w:numPr>
-          <w:ilvl w:val="1"/>
-          <w:numId w:val="1"/>
-        </w:numPr>
-        <w:spacing w:after="240" w:before="0" w:beforeAutospacing="0" w:lineRule="auto"/>
-        <w:ind w:left="1440" w:hanging="360"/>
-        <w:rPr/>
-      </w:pPr>
-      <w:r>
-        <w:rPr>
-          <w:b w:val="1"/>
-          <w:bCs w:val="1"/>
-          <w:rtl w:val="0"/>
-        </w:rPr>
-        <w:t xml:space="preserve">Autorización (RLS):</w:t>
-      </w:r>
-      <w:r>
-        <w:rPr>
-          <w:rtl w:val="0"/>
-        </w:rPr>
-        <w:t xml:space="preserve"> Uso de </w:t>
-      </w:r>
-      <w:r>
-        <w:rPr>
-          <w:i w:val="1"/>
-          <w:iCs w:val="1"/>
-          <w:rtl w:val="0"/>
-        </w:rPr>
-        <w:t xml:space="preserve">Row Level Security</w:t>
-      </w:r>
-      <w:r>
-        <w:rPr>
-          <w:rtl w:val="0"/>
-        </w:rPr>
-        <w:t xml:space="preserve"> en la base de datos para asegurar que solo usuarios autorizados puedan modificar registros críticos.</w:t>
-      </w:r>
-    </w:p>
-    <w:p>
-      <w:pPr>
-        <w:spacing w:after="240" w:before="240" w:lineRule="auto"/>
-        <w:rPr/>
-      </w:pPr>
-      <w:r>
-        <w:rPr>
-          <w:rtl w:val="0"/>
-        </w:rPr>
-      </w:r>
-    </w:p>
-    <w:p>
-      <w:pPr>
-        <w:pStyle w:val="Heading1"/>
+        <w:t xml:space="preserve">10</w:t>
+      </w:r>
+      <w:r>
         <w:rPr>
           <w:b w:val="1"/>
           <w:bCs w:val="1"/>
           <w:sz w:val="28"/>
           <w:szCs w:val="28"/>
-        </w:rPr>
-      </w:pPr>
-      <w:bookmarkStart w:colFirst="0" w:colLast="0" w:name="_ggpne0y61xeh" w:id="22"/>
-      <w:bookmarkEnd w:id="22"/>
-      <w:r>
-        <w:rPr>
-          <w:b w:val="1"/>
-          <w:bCs w:val="1"/>
-          <w:sz w:val="28"/>
-          <w:szCs w:val="28"/>
-          <w:rtl w:val="0"/>
-        </w:rPr>
-        <w:t xml:space="preserve">9. Conclusión </w:t>
+          <w:rtl w:val="0"/>
+        </w:rPr>
+        <w:t xml:space="preserve">. Conclusión </w:t>
       </w:r>
     </w:p>
     <w:p>
@@ -4738,35 +5701,7 @@
         <w:rPr>
           <w:rtl w:val="0"/>
         </w:rPr>
-        <w:t xml:space="preserve">La propuesta de solución para </w:t>
-      </w:r>
-      <w:r>
-        <w:rPr>
-          <w:b w:val="1"/>
-          <w:bCs w:val="1"/>
-          <w:rtl w:val="0"/>
-        </w:rPr>
-        <w:t xml:space="preserve">Input Medical</w:t>
-      </w:r>
-      <w:r>
-        <w:rPr>
-          <w:rtl w:val="0"/>
-        </w:rPr>
-        <w:t xml:space="preserve"> trasciende la mera digitalización de registros; representa el diseño de un ecosistema digital íntegro, seguro y altamente eficiente. Al integrar tecnologías de vanguardia como </w:t>
-      </w:r>
-      <w:r>
-        <w:rPr>
-          <w:b w:val="1"/>
-          <w:bCs w:val="1"/>
-          <w:rtl w:val="0"/>
-        </w:rPr>
-        <w:t xml:space="preserve">React y Supabase</w:t>
-      </w:r>
-      <w:r>
-        <w:rPr>
-          <w:rtl w:val="0"/>
-        </w:rPr>
-        <w:t xml:space="preserve">, el sistema no solo resuelve la problemática inmediata del descontrol de stock, sino que posiciona a la empresa en un estándar de madurez tecnológica superior.</w:t>
+        <w:t xml:space="preserve">La viabilidad de este proyecto descansa en la rigurosa documentación de sus atributos de calidad: la integridad en el manejo de insumos críticos, la precisión en el control de vencimientos bajo lógica FIFO y la seguridad en el acceso a la información mediante autenticación JWT y control de roles diferenciados. El desarrollo se estructuró bajo una metodología en cascada, coherente con los plazos definidos en la carta Gantt, lo que permitió avanzar de forma ordenada y controlada a través de las fases de análisis, diseño, desarrollo y pruebas, sin retroceder a etapas anteriores.</w:t>
       </w:r>
     </w:p>
     <w:p>
@@ -4778,77 +5713,7 @@
         <w:rPr>
           <w:rtl w:val="0"/>
         </w:rPr>
-        <w:t xml:space="preserve">La viabilidad de este proyecto descansa en la rigurosa documentación de sus </w:t>
-      </w:r>
-      <w:r>
-        <w:rPr>
-          <w:b w:val="1"/>
-          <w:bCs w:val="1"/>
-          <w:rtl w:val="0"/>
-        </w:rPr>
-        <w:t xml:space="preserve">atributos de calidad</w:t>
-      </w:r>
-      <w:r>
-        <w:rPr>
-          <w:rtl w:val="0"/>
-        </w:rPr>
-        <w:t xml:space="preserve">: la </w:t>
-      </w:r>
-      <w:r>
-        <w:rPr>
-          <w:b w:val="1"/>
-          <w:bCs w:val="1"/>
-          <w:rtl w:val="0"/>
-        </w:rPr>
-        <w:t xml:space="preserve">integridad</w:t>
-      </w:r>
-      <w:r>
-        <w:rPr>
-          <w:rtl w:val="0"/>
-        </w:rPr>
-        <w:t xml:space="preserve"> en el manejo de insumos críticos, la </w:t>
-      </w:r>
-      <w:r>
-        <w:rPr>
-          <w:b w:val="1"/>
-          <w:bCs w:val="1"/>
-          <w:rtl w:val="0"/>
-        </w:rPr>
-        <w:t xml:space="preserve">precisión</w:t>
-      </w:r>
-      <w:r>
-        <w:rPr>
-          <w:rtl w:val="0"/>
-        </w:rPr>
-        <w:t xml:space="preserve"> en el control de vencimientos bajo lógica FIFO y la </w:t>
-      </w:r>
-      <w:r>
-        <w:rPr>
-          <w:b w:val="1"/>
-          <w:bCs w:val="1"/>
-          <w:rtl w:val="0"/>
-        </w:rPr>
-        <w:t xml:space="preserve">seguridad</w:t>
-      </w:r>
-      <w:r>
-        <w:rPr>
-          <w:rtl w:val="0"/>
-        </w:rPr>
-        <w:t xml:space="preserve"> en el acceso a la información mediante protocolos modernos. En conjunto con una </w:t>
-      </w:r>
-      <w:r>
-        <w:rPr>
-          <w:b w:val="1"/>
-          <w:bCs w:val="1"/>
-          <w:rtl w:val="0"/>
-        </w:rPr>
-        <w:t xml:space="preserve">metodología de trabajo ágil y coherente</w:t>
-      </w:r>
-      <w:r>
-        <w:rPr>
-          <w:rtl w:val="0"/>
-        </w:rPr>
-        <w:t xml:space="preserve"> con los plazos definidos, este proyecto asegura una transición fluida hacia una gestión basada en datos reales. Finalmente, la elaboración de documentación técnica y manuales de usuario bajo estándares de la industria garantiza que la solución no sea solo un software funcional, sino un activo estratégico, confiable y certificable para el crecimiento de la organización.</w:t>
+        <w:t xml:space="preserve">A lo largo del proyecto se generó documentación técnica que acompaña cada etapa del desarrollo: diagramas de arquitectura, matriz de trazabilidad, plan de pruebas y configuración de servidor. Esto asegura que el sistema no quede como una entrega aislada, sino como una solución documentada, mantenible y lista para crecer junto con las necesidades de Input Medical.</w:t>
       </w:r>
     </w:p>
     <w:p>
@@ -5139,24 +6004,41 @@
     </w:p>
     <w:p>
       <w:pPr>
-        <w:pStyle w:val="Heading1"/>
+        <w:spacing w:after="240" w:before="240" w:lineRule="auto"/>
+        <w:rPr/>
+      </w:pPr>
+      <w:r>
+        <w:rPr>
+          <w:rtl w:val="0"/>
+        </w:rPr>
+      </w:r>
+    </w:p>
+    <w:p>
+      <w:pPr>
+        <w:spacing w:after="240" w:before="240" w:lineRule="auto"/>
+        <w:rPr/>
+      </w:pPr>
+      <w:r>
+        <w:rPr>
+          <w:rtl w:val="0"/>
+        </w:rPr>
+      </w:r>
+    </w:p>
+    <w:p>
+      <w:pPr>
+        <w:pStyle w:val="Heading2"/>
         <w:numPr>
           <w:ilvl w:val="0"/>
           <w:numId w:val="10"/>
         </w:numPr>
         <w:spacing w:after="240" w:before="240" w:lineRule="auto"/>
         <w:ind w:left="720" w:hanging="360"/>
-        <w:rPr>
-          <w:sz w:val="28"/>
-          <w:szCs w:val="28"/>
-        </w:rPr>
-      </w:pPr>
-      <w:bookmarkStart w:colFirst="0" w:colLast="0" w:name="_isxbacpluuc5" w:id="23"/>
-      <w:bookmarkEnd w:id="23"/>
-      <w:r>
-        <w:rPr>
-          <w:sz w:val="28"/>
-          <w:szCs w:val="28"/>
+        <w:rPr/>
+      </w:pPr>
+      <w:bookmarkStart w:colFirst="0" w:colLast="0" w:name="_isxbacpluuc5" w:id="27"/>
+      <w:bookmarkEnd w:id="27"/>
+      <w:r>
+        <w:rPr>
           <w:rtl w:val="0"/>
         </w:rPr>
         <w:t xml:space="preserve"> matriz de trazabilidad</w:t>
@@ -5186,7 +6068,7 @@
     </w:p>
     <w:tbl>
       <w:tblPr>
-        <w:tblStyle w:val="Table1"/>
+        <w:tblStyle w:val="Table2"/>
         <w:tblW w:w="10605.0" w:type="dxa"/>
         <w:jc w:val="left"/>
         <w:tblInd w:w="-780.0" w:type="dxa"/>
@@ -7794,15 +8676,49 @@
     </w:p>
     <w:p>
       <w:pPr>
+        <w:ind w:left="720" w:firstLine="0"/>
+        <w:rPr/>
+      </w:pPr>
+      <w:r>
+        <w:rPr>
+          <w:rtl w:val="0"/>
+        </w:rPr>
+      </w:r>
+    </w:p>
+    <w:p>
+      <w:pPr>
+        <w:ind w:left="720" w:firstLine="0"/>
+        <w:rPr/>
+      </w:pPr>
+      <w:r>
+        <w:rPr>
+          <w:rtl w:val="0"/>
+        </w:rPr>
+      </w:r>
+    </w:p>
+    <w:p>
+      <w:pPr>
+        <w:ind w:left="720" w:firstLine="0"/>
+        <w:rPr/>
+      </w:pPr>
+      <w:r>
+        <w:rPr>
+          <w:rtl w:val="0"/>
+        </w:rPr>
+      </w:r>
+    </w:p>
+    <w:p>
+      <w:pPr>
+        <w:pStyle w:val="Heading2"/>
         <w:numPr>
           <w:ilvl w:val="0"/>
           <w:numId w:val="10"/>
         </w:numPr>
         <w:ind w:left="720" w:hanging="360"/>
-        <w:rPr>
-          <w:u w:val="none"/>
-        </w:rPr>
-      </w:pPr>
+        <w:rPr/>
+      </w:pPr>
+      <w:bookmarkStart w:colFirst="0" w:colLast="0" w:name="_y5t7vu5b4w48" w:id="28"/>
+      <w:bookmarkEnd w:id="28"/>
       <w:r>
         <w:rPr>
           <w:rtl w:val="0"/>
@@ -7820,12 +8736,12 @@
           <wp:inline distB="114300" distT="114300" distL="114300" distR="114300">
             <wp:extent cx="5731200" cy="4292600"/>
             <wp:effectExtent b="0" l="0" r="0" t="0"/>
-            <wp:docPr id="7" name="image6.png"/>
+            <wp:docPr id="7" name="image9.png"/>
             <a:graphic>
               <a:graphicData uri="http://schemas.openxmlformats.org/drawingml/2006/picture">
                 <pic:pic>
                   <pic:nvPicPr>
-                    <pic:cNvPr id="0" name="image6.png"/>
+                    <pic:cNvPr id="0" name="image9.png"/>
                     <pic:cNvPicPr preferRelativeResize="0"/>
                   </pic:nvPicPr>
                   <pic:blipFill>
@@ -7875,8 +8791,8 @@
         <w:ind w:left="720" w:hanging="360"/>
         <w:rPr/>
       </w:pPr>
-      <w:bookmarkStart w:colFirst="0" w:colLast="0" w:name="_od25loe5ltwl" w:id="24"/>
-      <w:bookmarkEnd w:id="24"/>
+      <w:bookmarkStart w:colFirst="0" w:colLast="0" w:name="_od25loe5ltwl" w:id="29"/>
+      <w:bookmarkEnd w:id="29"/>
       <w:r>
         <w:rPr>
           <w:rtl w:val="0"/>
@@ -7895,12 +8811,12 @@
           <wp:inline distB="114300" distT="114300" distL="114300" distR="114300">
             <wp:extent cx="5731200" cy="4191000"/>
             <wp:effectExtent b="0" l="0" r="0" t="0"/>
-            <wp:docPr id="5" name="image8.png"/>
+            <wp:docPr id="5" name="image7.png"/>
             <a:graphic>
               <a:graphicData uri="http://schemas.openxmlformats.org/drawingml/2006/picture">
                 <pic:pic>
                   <pic:nvPicPr>
-                    <pic:cNvPr id="0" name="image8.png"/>
+                    <pic:cNvPr id="0" name="image7.png"/>
                     <pic:cNvPicPr preferRelativeResize="0"/>
                   </pic:nvPicPr>
                   <pic:blipFill>
@@ -7943,15 +8859,16 @@
     </w:p>
     <w:p>
       <w:pPr>
+        <w:pStyle w:val="Heading2"/>
         <w:numPr>
           <w:ilvl w:val="0"/>
           <w:numId w:val="10"/>
         </w:numPr>
         <w:ind w:left="720" w:hanging="360"/>
-        <w:rPr>
-          <w:u w:val="none"/>
-        </w:rPr>
-      </w:pPr>
+        <w:rPr/>
+      </w:pPr>
+      <w:bookmarkStart w:colFirst="0" w:colLast="0" w:name="_a8dig2ackk90" w:id="30"/>
+      <w:bookmarkEnd w:id="30"/>
       <w:r>
         <w:rPr>
           <w:rtl w:val="0"/>
@@ -7969,12 +8886,12 @@
           <wp:inline distB="114300" distT="114300" distL="114300" distR="114300">
             <wp:extent cx="5731200" cy="4292600"/>
             <wp:effectExtent b="0" l="0" r="0" t="0"/>
-            <wp:docPr id="2" name="image5.png"/>
+            <wp:docPr id="2" name="image8.png"/>
             <a:graphic>
               <a:graphicData uri="http://schemas.openxmlformats.org/drawingml/2006/picture">
                 <pic:pic>
                   <pic:nvPicPr>
-                    <pic:cNvPr id="0" name="image5.png"/>
+                    <pic:cNvPr id="0" name="image8.png"/>
                     <pic:cNvPicPr preferRelativeResize="0"/>
                   </pic:nvPicPr>
                   <pic:blipFill>
@@ -8004,6 +8921,87 @@
         </w:rPr>
       </w:r>
     </w:p>
+    <w:p>
+      <w:pPr>
+        <w:rPr/>
+      </w:pPr>
+      <w:r>
+        <w:rPr>
+          <w:rtl w:val="0"/>
+        </w:rPr>
+      </w:r>
+    </w:p>
+    <w:p>
+      <w:pPr>
+        <w:rPr/>
+      </w:pPr>
+      <w:r>
+        <w:rPr>
+          <w:rtl w:val="0"/>
+        </w:rPr>
+      </w:r>
+    </w:p>
+    <w:p>
+      <w:pPr>
+        <w:pStyle w:val="Heading2"/>
+        <w:ind w:left="720" w:firstLine="0"/>
+        <w:rPr/>
+      </w:pPr>
+      <w:bookmarkStart w:colFirst="0" w:colLast="0" w:name="_mf121lhfki3z" w:id="31"/>
+      <w:bookmarkEnd w:id="31"/>
+      <w:r>
+        <w:rPr>
+          <w:rtl w:val="0"/>
+        </w:rPr>
+        <w:t xml:space="preserve">f. Diagrama Modelo Entidad - Relación</w:t>
+      </w:r>
+    </w:p>
+    <w:p>
+      <w:pPr>
+        <w:ind w:left="720" w:firstLine="0"/>
+        <w:rPr/>
+      </w:pPr>
+      <w:r>
+        <w:rPr/>
+        <w:drawing>
+          <wp:inline distB="114300" distT="114300" distL="114300" distR="114300">
+            <wp:extent cx="5995988" cy="3147395"/>
+            <wp:effectExtent b="0" l="0" r="0" t="0"/>
+            <wp:docPr id="8" name="image2.png"/>
+            <a:graphic>
+              <a:graphicData uri="http://schemas.openxmlformats.org/drawingml/2006/picture">
+                <pic:pic>
+                  <pic:nvPicPr>
+                    <pic:cNvPr id="0" name="image2.png"/>
+                    <pic:cNvPicPr preferRelativeResize="0"/>
+                  </pic:nvPicPr>
+                  <pic:blipFill>
+                    <a:blip r:embed="rId14"/>
+                    <a:srcRect b="0" l="0" r="0" t="0"/>
+                    <a:stretch>
+                      <a:fillRect/>
+                    </a:stretch>
+                  </pic:blipFill>
+                  <pic:spPr>
+                    <a:xfrm>
+                      <a:off x="0" y="0"/>
+                      <a:ext cx="5995988" cy="3147395"/>
+                    </a:xfrm>
+                    <a:prstGeom prst="rect"/>
+                    <a:ln/>
+                  </pic:spPr>
+                </pic:pic>
+              </a:graphicData>
+            </a:graphic>
+          </wp:inline>
+        </w:drawing>
+      </w:r>
+      <w:r>
+        <w:rPr>
+          <w:rtl w:val="0"/>
+        </w:rPr>
+      </w:r>
+    </w:p>
     <w:sectPr>
       <w:pgSz w:h="16834" w:w="11909" w:orient="portrait"/>
       <w:pgMar w:bottom="1440" w:top="1440" w:left="1440" w:right="1440" w:header="720" w:footer="720"/>
@@ -9556,6 +10554,116 @@
     </w:lvl>
   </w:abstractNum>
   <w:abstractNum w:abstractNumId="15">
+    <w:lvl w:ilvl="0">
+      <w:start w:val="1"/>
+      <w:numFmt w:val="bullet"/>
+      <w:lvlText w:val="●"/>
+      <w:lvlJc w:val="left"/>
+      <w:pPr>
+        <w:ind w:left="720" w:hanging="360"/>
+      </w:pPr>
+      <w:rPr>
+        <w:u w:val="none"/>
+      </w:rPr>
+    </w:lvl>
+    <w:lvl w:ilvl="1">
+      <w:start w:val="1"/>
+      <w:numFmt w:val="bullet"/>
+      <w:lvlText w:val="○"/>
+      <w:lvlJc w:val="left"/>
+      <w:pPr>
+        <w:ind w:left="1440" w:hanging="360"/>
+      </w:pPr>
+      <w:rPr>
+        <w:u w:val="none"/>
+      </w:rPr>
+    </w:lvl>
+    <w:lvl w:ilvl="2">
+      <w:start w:val="1"/>
+      <w:numFmt w:val="bullet"/>
+      <w:lvlText w:val="■"/>
+      <w:lvlJc w:val="left"/>
+      <w:pPr>
+        <w:ind w:left="2160" w:hanging="360"/>
+      </w:pPr>
+      <w:rPr>
+        <w:u w:val="none"/>
+      </w:rPr>
+    </w:lvl>
+    <w:lvl w:ilvl="3">
+      <w:start w:val="1"/>
+      <w:numFmt w:val="bullet"/>
+      <w:lvlText w:val="●"/>
+      <w:lvlJc w:val="left"/>
+      <w:pPr>
+        <w:ind w:left="2880" w:hanging="360"/>
+      </w:pPr>
+      <w:rPr>
+        <w:u w:val="none"/>
+      </w:rPr>
+    </w:lvl>
+    <w:lvl w:ilvl="4">
+      <w:start w:val="1"/>
+      <w:numFmt w:val="bullet"/>
+      <w:lvlText w:val="○"/>
+      <w:lvlJc w:val="left"/>
+      <w:pPr>
+        <w:ind w:left="3600" w:hanging="360"/>
+      </w:pPr>
+      <w:rPr>
+        <w:u w:val="none"/>
+      </w:rPr>
+    </w:lvl>
+    <w:lvl w:ilvl="5">
+      <w:start w:val="1"/>
+      <w:numFmt w:val="bullet"/>
+      <w:lvlText w:val="■"/>
+      <w:lvlJc w:val="left"/>
+      <w:pPr>
+        <w:ind w:left="4320" w:hanging="360"/>
+      </w:pPr>
+      <w:rPr>
+        <w:u w:val="none"/>
+      </w:rPr>
+    </w:lvl>
+    <w:lvl w:ilvl="6">
+      <w:start w:val="1"/>
+      <w:numFmt w:val="bullet"/>
+      <w:lvlText w:val="●"/>
+      <w:lvlJc w:val="left"/>
+      <w:pPr>
+        <w:ind w:left="5040" w:hanging="360"/>
+      </w:pPr>
+      <w:rPr>
+        <w:u w:val="none"/>
+      </w:rPr>
+    </w:lvl>
+    <w:lvl w:ilvl="7">
+      <w:start w:val="1"/>
+      <w:numFmt w:val="bullet"/>
+      <w:lvlText w:val="○"/>
+      <w:lvlJc w:val="left"/>
+      <w:pPr>
+        <w:ind w:left="5760" w:hanging="360"/>
+      </w:pPr>
+      <w:rPr>
+        <w:u w:val="none"/>
+      </w:rPr>
+    </w:lvl>
+    <w:lvl w:ilvl="8">
+      <w:start w:val="1"/>
+      <w:numFmt w:val="bullet"/>
+      <w:lvlText w:val="■"/>
+      <w:lvlJc w:val="left"/>
+      <w:pPr>
+        <w:ind w:left="6480" w:hanging="360"/>
+      </w:pPr>
+      <w:rPr>
+        <w:u w:val="none"/>
+      </w:rPr>
+    </w:lvl>
+  </w:abstractNum>
+  <w:abstractNum w:abstractNumId="16">
     <w:lvl w:ilvl="0">
       <w:start w:val="1"/>
       <w:numFmt w:val="bullet"/>
@@ -9709,6 +10817,9 @@
   </w:num>
   <w:num w:numId="15">
     <w:abstractNumId w:val="15"/>
+  </w:num>
+  <w:num w:numId="16">
+    <w:abstractNumId w:val="16"/>
   </w:num>
 </w:numbering>
 </file>
@@ -9879,6 +10990,50 @@
     </w:rPr>
   </w:style>
   <w:style w:type="table" w:styleId="Table1">
+    <w:basedOn w:val="TableNormal"/>
+    <w:tblPr>
+      <w:tblStyleRowBandSize w:val="1"/>
+      <w:tblStyleColBandSize w:val="1"/>
+      <w:tblCellMar/>
+    </w:tblPr>
+    <w:tblStylePr w:type="band1Horz">
+      <w:tcPr/>
+    </w:tblStylePr>
+    <w:tblStylePr w:type="band1Vert">
+      <w:tcPr/>
+    </w:tblStylePr>
+    <w:tblStylePr w:type="band2Horz">
+      <w:tcPr/>
+    </w:tblStylePr>
+    <w:tblStylePr w:type="band2Vert">
+      <w:tcPr/>
+    </w:tblStylePr>
+    <w:tblStylePr w:type="firstCol">
+      <w:tcPr/>
+    </w:tblStylePr>
+    <w:tblStylePr w:type="firstRow">
+      <w:tcPr/>
+    </w:tblStylePr>
+    <w:tblStylePr w:type="lastCol">
+      <w:tcPr/>
+    </w:tblStylePr>
+    <w:tblStylePr w:type="lastRow">
+      <w:tcPr/>
+    </w:tblStylePr>
+    <w:tblStylePr w:type="neCell">
+      <w:tcPr/>
+    </w:tblStylePr>
+    <w:tblStylePr w:type="nwCell">
+      <w:tcPr/>
+    </w:tblStylePr>
+    <w:tblStylePr w:type="seCell">
+      <w:tcPr/>
+    </w:tblStylePr>
+    <w:tblStylePr w:type="swCell">
+      <w:tcPr/>
+    </w:tblStylePr>
+  </w:style>
+  <w:style w:type="table" w:styleId="Table2">
     <w:basedOn w:val="TableNormal"/>
     <w:tblPr>
       <w:tblStyleRowBandSize w:val="1"/>

</xml_diff>